<commit_message>
fix: migrations for certifications and academic recors
</commit_message>
<xml_diff>
--- a/Documento1.docx
+++ b/Documento1.docx
@@ -4,7 +4,7 @@
   <w:body>
     <w:p>
       <w:pPr>
-        <w:pStyle w:val="895"/>
+        <w:pStyle w:val="899"/>
         <w:pBdr>
           <w:top w:val="none" w:color="000000" w:sz="4" w:space="0"/>
           <w:left w:val="none" w:color="000000" w:sz="4" w:space="0"/>
@@ -28,7 +28,7 @@
     </w:p>
     <w:p>
       <w:pPr>
-        <w:pStyle w:val="896"/>
+        <w:pStyle w:val="900"/>
         <w:pBdr>
           <w:top w:val="none" w:color="000000" w:sz="4" w:space="0"/>
           <w:left w:val="none" w:color="000000" w:sz="4" w:space="0"/>
@@ -52,7 +52,7 @@
     </w:p>
     <w:p>
       <w:pPr>
-        <w:pStyle w:val="896"/>
+        <w:pStyle w:val="900"/>
         <w:pBdr>
           <w:top w:val="none" w:color="000000" w:sz="4" w:space="0"/>
           <w:left w:val="none" w:color="000000" w:sz="4" w:space="0"/>
@@ -76,7 +76,7 @@
     </w:p>
     <w:p>
       <w:pPr>
-        <w:pStyle w:val="897"/>
+        <w:pStyle w:val="901"/>
         <w:pBdr>
           <w:top w:val="none" w:color="000000" w:sz="4" w:space="0"/>
           <w:left w:val="none" w:color="000000" w:sz="4" w:space="0"/>
@@ -122,7 +122,7 @@
     </w:p>
     <w:p>
       <w:pPr>
-        <w:pStyle w:val="958"/>
+        <w:pStyle w:val="962"/>
         <w:numPr>
           <w:ilvl w:val="0"/>
           <w:numId w:val="1"/>
@@ -149,7 +149,7 @@
     </w:p>
     <w:p>
       <w:pPr>
-        <w:pStyle w:val="958"/>
+        <w:pStyle w:val="962"/>
         <w:numPr>
           <w:ilvl w:val="0"/>
           <w:numId w:val="1"/>
@@ -176,7 +176,7 @@
     </w:p>
     <w:p>
       <w:pPr>
-        <w:pStyle w:val="958"/>
+        <w:pStyle w:val="962"/>
         <w:numPr>
           <w:ilvl w:val="0"/>
           <w:numId w:val="1"/>
@@ -203,7 +203,7 @@
     </w:p>
     <w:p>
       <w:pPr>
-        <w:pStyle w:val="958"/>
+        <w:pStyle w:val="962"/>
         <w:numPr>
           <w:ilvl w:val="0"/>
           <w:numId w:val="1"/>
@@ -230,7 +230,7 @@
     </w:p>
     <w:p>
       <w:pPr>
-        <w:pStyle w:val="958"/>
+        <w:pStyle w:val="962"/>
         <w:numPr>
           <w:ilvl w:val="0"/>
           <w:numId w:val="1"/>
@@ -257,7 +257,7 @@
     </w:p>
     <w:p>
       <w:pPr>
-        <w:pStyle w:val="958"/>
+        <w:pStyle w:val="962"/>
         <w:numPr>
           <w:ilvl w:val="0"/>
           <w:numId w:val="1"/>
@@ -284,7 +284,7 @@
     </w:p>
     <w:p>
       <w:pPr>
-        <w:pStyle w:val="958"/>
+        <w:pStyle w:val="962"/>
         <w:numPr>
           <w:ilvl w:val="0"/>
           <w:numId w:val="1"/>
@@ -311,7 +311,7 @@
     </w:p>
     <w:p>
       <w:pPr>
-        <w:pStyle w:val="958"/>
+        <w:pStyle w:val="962"/>
         <w:numPr>
           <w:ilvl w:val="0"/>
           <w:numId w:val="1"/>
@@ -338,7 +338,7 @@
     </w:p>
     <w:p>
       <w:pPr>
-        <w:pStyle w:val="958"/>
+        <w:pStyle w:val="962"/>
         <w:numPr>
           <w:ilvl w:val="0"/>
           <w:numId w:val="1"/>
@@ -365,7 +365,7 @@
     </w:p>
     <w:p>
       <w:pPr>
-        <w:pStyle w:val="958"/>
+        <w:pStyle w:val="962"/>
         <w:numPr>
           <w:ilvl w:val="0"/>
           <w:numId w:val="1"/>
@@ -392,7 +392,7 @@
     </w:p>
     <w:p>
       <w:pPr>
-        <w:pStyle w:val="958"/>
+        <w:pStyle w:val="962"/>
         <w:numPr>
           <w:ilvl w:val="0"/>
           <w:numId w:val="1"/>
@@ -419,7 +419,7 @@
     </w:p>
     <w:p>
       <w:pPr>
-        <w:pStyle w:val="958"/>
+        <w:pStyle w:val="962"/>
         <w:numPr>
           <w:ilvl w:val="0"/>
           <w:numId w:val="1"/>
@@ -477,7 +477,7 @@
     </w:p>
     <w:p>
       <w:pPr>
-        <w:pStyle w:val="897"/>
+        <w:pStyle w:val="901"/>
         <w:pBdr>
           <w:top w:val="none" w:color="000000" w:sz="4" w:space="0"/>
           <w:left w:val="none" w:color="000000" w:sz="4" w:space="0"/>
@@ -536,7 +536,7 @@
         </w:rPr>
         <w:t xml:space="preserve">.</w:t>
         <w:br/>
-        <w:t xml:space="preserve"> Cada registro debe poder </w:t>
+        <w:t xml:space="preserve">Cada registro debe poder </w:t>
       </w:r>
       <w:r>
         <w:rPr>
@@ -581,7 +581,7 @@
     </w:p>
     <w:p>
       <w:pPr>
-        <w:pStyle w:val="958"/>
+        <w:pStyle w:val="962"/>
         <w:numPr>
           <w:ilvl w:val="0"/>
           <w:numId w:val="2"/>
@@ -608,7 +608,7 @@
     </w:p>
     <w:p>
       <w:pPr>
-        <w:pStyle w:val="958"/>
+        <w:pStyle w:val="962"/>
         <w:numPr>
           <w:ilvl w:val="0"/>
           <w:numId w:val="2"/>
@@ -635,7 +635,7 @@
     </w:p>
     <w:p>
       <w:pPr>
-        <w:pStyle w:val="958"/>
+        <w:pStyle w:val="962"/>
         <w:numPr>
           <w:ilvl w:val="0"/>
           <w:numId w:val="2"/>
@@ -662,7 +662,7 @@
     </w:p>
     <w:p>
       <w:pPr>
-        <w:pStyle w:val="958"/>
+        <w:pStyle w:val="962"/>
         <w:numPr>
           <w:ilvl w:val="0"/>
           <w:numId w:val="2"/>
@@ -689,7 +689,7 @@
     </w:p>
     <w:p>
       <w:pPr>
-        <w:pStyle w:val="958"/>
+        <w:pStyle w:val="962"/>
         <w:numPr>
           <w:ilvl w:val="0"/>
           <w:numId w:val="2"/>
@@ -716,7 +716,7 @@
     </w:p>
     <w:p>
       <w:pPr>
-        <w:pStyle w:val="958"/>
+        <w:pStyle w:val="962"/>
         <w:numPr>
           <w:ilvl w:val="0"/>
           <w:numId w:val="2"/>
@@ -743,7 +743,7 @@
     </w:p>
     <w:p>
       <w:pPr>
-        <w:pStyle w:val="897"/>
+        <w:pStyle w:val="901"/>
         <w:pBdr>
           <w:top w:val="none" w:color="000000" w:sz="4" w:space="0"/>
           <w:left w:val="none" w:color="000000" w:sz="4" w:space="0"/>
@@ -828,7 +828,7 @@
     </w:p>
     <w:p>
       <w:pPr>
-        <w:pStyle w:val="958"/>
+        <w:pStyle w:val="962"/>
         <w:numPr>
           <w:ilvl w:val="0"/>
           <w:numId w:val="3"/>
@@ -855,7 +855,7 @@
     </w:p>
     <w:p>
       <w:pPr>
-        <w:pStyle w:val="958"/>
+        <w:pStyle w:val="962"/>
         <w:numPr>
           <w:ilvl w:val="0"/>
           <w:numId w:val="3"/>
@@ -882,7 +882,7 @@
     </w:p>
     <w:p>
       <w:pPr>
-        <w:pStyle w:val="958"/>
+        <w:pStyle w:val="962"/>
         <w:numPr>
           <w:ilvl w:val="0"/>
           <w:numId w:val="3"/>
@@ -909,7 +909,7 @@
     </w:p>
     <w:p>
       <w:pPr>
-        <w:pStyle w:val="958"/>
+        <w:pStyle w:val="962"/>
         <w:numPr>
           <w:ilvl w:val="0"/>
           <w:numId w:val="3"/>
@@ -936,7 +936,7 @@
     </w:p>
     <w:p>
       <w:pPr>
-        <w:pStyle w:val="958"/>
+        <w:pStyle w:val="962"/>
         <w:numPr>
           <w:ilvl w:val="0"/>
           <w:numId w:val="3"/>
@@ -963,7 +963,7 @@
     </w:p>
     <w:p>
       <w:pPr>
-        <w:pStyle w:val="958"/>
+        <w:pStyle w:val="962"/>
         <w:numPr>
           <w:ilvl w:val="0"/>
           <w:numId w:val="3"/>
@@ -990,7 +990,7 @@
     </w:p>
     <w:p>
       <w:pPr>
-        <w:pStyle w:val="958"/>
+        <w:pStyle w:val="962"/>
         <w:numPr>
           <w:ilvl w:val="0"/>
           <w:numId w:val="3"/>
@@ -1017,7 +1017,7 @@
     </w:p>
     <w:p>
       <w:pPr>
-        <w:pStyle w:val="958"/>
+        <w:pStyle w:val="962"/>
         <w:numPr>
           <w:ilvl w:val="0"/>
           <w:numId w:val="3"/>
@@ -1044,7 +1044,7 @@
     </w:p>
     <w:p>
       <w:pPr>
-        <w:pStyle w:val="897"/>
+        <w:pStyle w:val="901"/>
         <w:pBdr>
           <w:top w:val="none" w:color="000000" w:sz="4" w:space="0"/>
           <w:left w:val="none" w:color="000000" w:sz="4" w:space="0"/>
@@ -1112,7 +1112,7 @@
     </w:p>
     <w:p>
       <w:pPr>
-        <w:pStyle w:val="958"/>
+        <w:pStyle w:val="962"/>
         <w:numPr>
           <w:ilvl w:val="0"/>
           <w:numId w:val="4"/>
@@ -1139,7 +1139,7 @@
     </w:p>
     <w:p>
       <w:pPr>
-        <w:pStyle w:val="958"/>
+        <w:pStyle w:val="962"/>
         <w:numPr>
           <w:ilvl w:val="0"/>
           <w:numId w:val="4"/>
@@ -1166,7 +1166,7 @@
     </w:p>
     <w:p>
       <w:pPr>
-        <w:pStyle w:val="958"/>
+        <w:pStyle w:val="962"/>
         <w:numPr>
           <w:ilvl w:val="0"/>
           <w:numId w:val="4"/>
@@ -1193,7 +1193,7 @@
     </w:p>
     <w:p>
       <w:pPr>
-        <w:pStyle w:val="958"/>
+        <w:pStyle w:val="962"/>
         <w:numPr>
           <w:ilvl w:val="0"/>
           <w:numId w:val="4"/>
@@ -1220,7 +1220,7 @@
     </w:p>
     <w:p>
       <w:pPr>
-        <w:pStyle w:val="896"/>
+        <w:pStyle w:val="900"/>
         <w:pBdr>
           <w:top w:val="none" w:color="000000" w:sz="4" w:space="0"/>
           <w:left w:val="none" w:color="000000" w:sz="4" w:space="0"/>
@@ -1283,7 +1283,7 @@
     </w:p>
     <w:p>
       <w:pPr>
-        <w:pStyle w:val="897"/>
+        <w:pStyle w:val="901"/>
         <w:pBdr>
           <w:top w:val="none" w:color="000000" w:sz="4" w:space="0"/>
           <w:left w:val="none" w:color="000000" w:sz="4" w:space="0"/>
@@ -1307,7 +1307,7 @@
     </w:p>
     <w:p>
       <w:pPr>
-        <w:pStyle w:val="958"/>
+        <w:pStyle w:val="962"/>
         <w:numPr>
           <w:ilvl w:val="0"/>
           <w:numId w:val="5"/>
@@ -1351,7 +1351,7 @@
     </w:p>
     <w:p>
       <w:pPr>
-        <w:pStyle w:val="958"/>
+        <w:pStyle w:val="962"/>
         <w:numPr>
           <w:ilvl w:val="0"/>
           <w:numId w:val="5"/>
@@ -1395,7 +1395,7 @@
     </w:p>
     <w:p>
       <w:pPr>
-        <w:pStyle w:val="958"/>
+        <w:pStyle w:val="962"/>
         <w:numPr>
           <w:ilvl w:val="0"/>
           <w:numId w:val="5"/>
@@ -1439,7 +1439,7 @@
     </w:p>
     <w:p>
       <w:pPr>
-        <w:pStyle w:val="958"/>
+        <w:pStyle w:val="962"/>
         <w:numPr>
           <w:ilvl w:val="0"/>
           <w:numId w:val="5"/>
@@ -1483,7 +1483,7 @@
     </w:p>
     <w:p>
       <w:pPr>
-        <w:pStyle w:val="958"/>
+        <w:pStyle w:val="962"/>
         <w:numPr>
           <w:ilvl w:val="0"/>
           <w:numId w:val="5"/>
@@ -1527,7 +1527,7 @@
     </w:p>
     <w:p>
       <w:pPr>
-        <w:pStyle w:val="958"/>
+        <w:pStyle w:val="962"/>
         <w:numPr>
           <w:ilvl w:val="0"/>
           <w:numId w:val="5"/>
@@ -1571,7 +1571,7 @@
     </w:p>
     <w:p>
       <w:pPr>
-        <w:pStyle w:val="958"/>
+        <w:pStyle w:val="962"/>
         <w:numPr>
           <w:ilvl w:val="0"/>
           <w:numId w:val="5"/>
@@ -1615,7 +1615,7 @@
     </w:p>
     <w:p>
       <w:pPr>
-        <w:pStyle w:val="958"/>
+        <w:pStyle w:val="962"/>
         <w:numPr>
           <w:ilvl w:val="0"/>
           <w:numId w:val="5"/>
@@ -1659,7 +1659,7 @@
     </w:p>
     <w:p>
       <w:pPr>
-        <w:pStyle w:val="958"/>
+        <w:pStyle w:val="962"/>
         <w:numPr>
           <w:ilvl w:val="0"/>
           <w:numId w:val="5"/>
@@ -1703,7 +1703,7 @@
     </w:p>
     <w:p>
       <w:pPr>
-        <w:pStyle w:val="958"/>
+        <w:pStyle w:val="962"/>
         <w:numPr>
           <w:ilvl w:val="0"/>
           <w:numId w:val="5"/>
@@ -1747,7 +1747,7 @@
     </w:p>
     <w:p>
       <w:pPr>
-        <w:pStyle w:val="958"/>
+        <w:pStyle w:val="962"/>
         <w:numPr>
           <w:ilvl w:val="0"/>
           <w:numId w:val="5"/>
@@ -1791,7 +1791,7 @@
     </w:p>
     <w:p>
       <w:pPr>
-        <w:pStyle w:val="958"/>
+        <w:pStyle w:val="962"/>
         <w:numPr>
           <w:ilvl w:val="0"/>
           <w:numId w:val="5"/>
@@ -1818,7 +1818,7 @@
     </w:p>
     <w:p>
       <w:pPr>
-        <w:pStyle w:val="958"/>
+        <w:pStyle w:val="962"/>
         <w:numPr>
           <w:ilvl w:val="1"/>
           <w:numId w:val="6"/>
@@ -1845,7 +1845,7 @@
     </w:p>
     <w:p>
       <w:pPr>
-        <w:pStyle w:val="958"/>
+        <w:pStyle w:val="962"/>
         <w:numPr>
           <w:ilvl w:val="1"/>
           <w:numId w:val="6"/>
@@ -1872,7 +1872,7 @@
     </w:p>
     <w:p>
       <w:pPr>
-        <w:pStyle w:val="958"/>
+        <w:pStyle w:val="962"/>
         <w:numPr>
           <w:ilvl w:val="1"/>
           <w:numId w:val="6"/>
@@ -1899,7 +1899,7 @@
     </w:p>
     <w:p>
       <w:pPr>
-        <w:pStyle w:val="958"/>
+        <w:pStyle w:val="962"/>
         <w:numPr>
           <w:ilvl w:val="1"/>
           <w:numId w:val="6"/>
@@ -1926,7 +1926,7 @@
     </w:p>
     <w:p>
       <w:pPr>
-        <w:pStyle w:val="958"/>
+        <w:pStyle w:val="962"/>
         <w:numPr>
           <w:ilvl w:val="0"/>
           <w:numId w:val="7"/>
@@ -1970,7 +1970,7 @@
     </w:p>
     <w:p>
       <w:pPr>
-        <w:pStyle w:val="958"/>
+        <w:pStyle w:val="962"/>
         <w:numPr>
           <w:ilvl w:val="0"/>
           <w:numId w:val="7"/>
@@ -2014,7 +2014,7 @@
     </w:p>
     <w:p>
       <w:pPr>
-        <w:pStyle w:val="958"/>
+        <w:pStyle w:val="962"/>
         <w:numPr>
           <w:ilvl w:val="0"/>
           <w:numId w:val="7"/>
@@ -2058,7 +2058,7 @@
     </w:p>
     <w:p>
       <w:pPr>
-        <w:pStyle w:val="896"/>
+        <w:pStyle w:val="900"/>
         <w:pBdr>
           <w:top w:val="none" w:color="000000" w:sz="4" w:space="0"/>
           <w:left w:val="none" w:color="000000" w:sz="4" w:space="0"/>
@@ -2082,7 +2082,7 @@
     </w:p>
     <w:p>
       <w:pPr>
-        <w:pStyle w:val="897"/>
+        <w:pStyle w:val="901"/>
         <w:pBdr>
           <w:top w:val="none" w:color="000000" w:sz="4" w:space="0"/>
           <w:left w:val="none" w:color="000000" w:sz="4" w:space="0"/>
@@ -2128,7 +2128,7 @@
     </w:p>
     <w:p>
       <w:pPr>
-        <w:pStyle w:val="958"/>
+        <w:pStyle w:val="962"/>
         <w:numPr>
           <w:ilvl w:val="0"/>
           <w:numId w:val="8"/>
@@ -2172,7 +2172,7 @@
     </w:p>
     <w:p>
       <w:pPr>
-        <w:pStyle w:val="958"/>
+        <w:pStyle w:val="962"/>
         <w:numPr>
           <w:ilvl w:val="1"/>
           <w:numId w:val="8"/>
@@ -2199,7 +2199,7 @@
     </w:p>
     <w:p>
       <w:pPr>
-        <w:pStyle w:val="958"/>
+        <w:pStyle w:val="962"/>
         <w:numPr>
           <w:ilvl w:val="1"/>
           <w:numId w:val="8"/>
@@ -2226,7 +2226,7 @@
     </w:p>
     <w:p>
       <w:pPr>
-        <w:pStyle w:val="958"/>
+        <w:pStyle w:val="962"/>
         <w:numPr>
           <w:ilvl w:val="1"/>
           <w:numId w:val="8"/>
@@ -2253,7 +2253,7 @@
     </w:p>
     <w:p>
       <w:pPr>
-        <w:pStyle w:val="958"/>
+        <w:pStyle w:val="962"/>
         <w:numPr>
           <w:ilvl w:val="0"/>
           <w:numId w:val="8"/>
@@ -2297,7 +2297,7 @@
     </w:p>
     <w:p>
       <w:pPr>
-        <w:pStyle w:val="897"/>
+        <w:pStyle w:val="901"/>
         <w:pBdr>
           <w:top w:val="none" w:color="000000" w:sz="4" w:space="0"/>
           <w:left w:val="none" w:color="000000" w:sz="4" w:space="0"/>
@@ -2321,7 +2321,7 @@
     </w:p>
     <w:p>
       <w:pPr>
-        <w:pStyle w:val="958"/>
+        <w:pStyle w:val="962"/>
         <w:numPr>
           <w:ilvl w:val="0"/>
           <w:numId w:val="9"/>
@@ -2348,7 +2348,7 @@
     </w:p>
     <w:p>
       <w:pPr>
-        <w:pStyle w:val="958"/>
+        <w:pStyle w:val="962"/>
         <w:numPr>
           <w:ilvl w:val="0"/>
           <w:numId w:val="9"/>
@@ -2392,7 +2392,7 @@
     </w:p>
     <w:p>
       <w:pPr>
-        <w:pStyle w:val="958"/>
+        <w:pStyle w:val="962"/>
         <w:numPr>
           <w:ilvl w:val="0"/>
           <w:numId w:val="9"/>
@@ -2419,7 +2419,7 @@
     </w:p>
     <w:p>
       <w:pPr>
-        <w:pStyle w:val="958"/>
+        <w:pStyle w:val="962"/>
         <w:numPr>
           <w:ilvl w:val="0"/>
           <w:numId w:val="9"/>
@@ -2463,7 +2463,7 @@
     </w:p>
     <w:p>
       <w:pPr>
-        <w:pStyle w:val="958"/>
+        <w:pStyle w:val="962"/>
         <w:numPr>
           <w:ilvl w:val="1"/>
           <w:numId w:val="10"/>
@@ -2490,7 +2490,7 @@
     </w:p>
     <w:p>
       <w:pPr>
-        <w:pStyle w:val="958"/>
+        <w:pStyle w:val="962"/>
         <w:numPr>
           <w:ilvl w:val="1"/>
           <w:numId w:val="10"/>
@@ -2517,7 +2517,7 @@
     </w:p>
     <w:p>
       <w:pPr>
-        <w:pStyle w:val="958"/>
+        <w:pStyle w:val="962"/>
         <w:numPr>
           <w:ilvl w:val="1"/>
           <w:numId w:val="10"/>
@@ -2544,7 +2544,7 @@
     </w:p>
     <w:p>
       <w:pPr>
-        <w:pStyle w:val="958"/>
+        <w:pStyle w:val="962"/>
         <w:numPr>
           <w:ilvl w:val="1"/>
           <w:numId w:val="10"/>
@@ -2571,7 +2571,7 @@
     </w:p>
     <w:p>
       <w:pPr>
-        <w:pStyle w:val="958"/>
+        <w:pStyle w:val="962"/>
         <w:numPr>
           <w:ilvl w:val="0"/>
           <w:numId w:val="11"/>
@@ -2615,7 +2615,7 @@
     </w:p>
     <w:p>
       <w:pPr>
-        <w:pStyle w:val="958"/>
+        <w:pStyle w:val="962"/>
         <w:numPr>
           <w:ilvl w:val="0"/>
           <w:numId w:val="11"/>
@@ -2659,7 +2659,7 @@
     </w:p>
     <w:p>
       <w:pPr>
-        <w:pStyle w:val="896"/>
+        <w:pStyle w:val="900"/>
         <w:pBdr>
           <w:top w:val="none" w:color="000000" w:sz="4" w:space="0"/>
           <w:left w:val="none" w:color="000000" w:sz="4" w:space="0"/>
@@ -2683,7 +2683,7 @@
     </w:p>
     <w:p>
       <w:pPr>
-        <w:pStyle w:val="958"/>
+        <w:pStyle w:val="962"/>
         <w:numPr>
           <w:ilvl w:val="0"/>
           <w:numId w:val="12"/>
@@ -2727,7 +2727,7 @@
     </w:p>
     <w:p>
       <w:pPr>
-        <w:pStyle w:val="958"/>
+        <w:pStyle w:val="962"/>
         <w:numPr>
           <w:ilvl w:val="1"/>
           <w:numId w:val="12"/>
@@ -2754,7 +2754,7 @@
     </w:p>
     <w:p>
       <w:pPr>
-        <w:pStyle w:val="958"/>
+        <w:pStyle w:val="962"/>
         <w:numPr>
           <w:ilvl w:val="1"/>
           <w:numId w:val="12"/>
@@ -2781,7 +2781,7 @@
     </w:p>
     <w:p>
       <w:pPr>
-        <w:pStyle w:val="958"/>
+        <w:pStyle w:val="962"/>
         <w:numPr>
           <w:ilvl w:val="1"/>
           <w:numId w:val="12"/>
@@ -2808,7 +2808,7 @@
     </w:p>
     <w:p>
       <w:pPr>
-        <w:pStyle w:val="958"/>
+        <w:pStyle w:val="962"/>
         <w:numPr>
           <w:ilvl w:val="1"/>
           <w:numId w:val="12"/>
@@ -2835,7 +2835,7 @@
     </w:p>
     <w:p>
       <w:pPr>
-        <w:pStyle w:val="958"/>
+        <w:pStyle w:val="962"/>
         <w:numPr>
           <w:ilvl w:val="0"/>
           <w:numId w:val="12"/>
@@ -2871,7 +2871,7 @@
     </w:p>
     <w:p>
       <w:pPr>
-        <w:pStyle w:val="896"/>
+        <w:pStyle w:val="900"/>
         <w:pBdr>
           <w:top w:val="none" w:color="000000" w:sz="4" w:space="0"/>
           <w:left w:val="none" w:color="000000" w:sz="4" w:space="0"/>
@@ -2917,7 +2917,7 @@
     </w:p>
     <w:p>
       <w:pPr>
-        <w:pStyle w:val="958"/>
+        <w:pStyle w:val="962"/>
         <w:numPr>
           <w:ilvl w:val="0"/>
           <w:numId w:val="13"/>
@@ -2944,7 +2944,7 @@
     </w:p>
     <w:p>
       <w:pPr>
-        <w:pStyle w:val="958"/>
+        <w:pStyle w:val="962"/>
         <w:numPr>
           <w:ilvl w:val="0"/>
           <w:numId w:val="13"/>
@@ -2971,7 +2971,7 @@
     </w:p>
     <w:p>
       <w:pPr>
-        <w:pStyle w:val="958"/>
+        <w:pStyle w:val="962"/>
         <w:numPr>
           <w:ilvl w:val="0"/>
           <w:numId w:val="13"/>
@@ -2998,7 +2998,7 @@
     </w:p>
     <w:p>
       <w:pPr>
-        <w:pStyle w:val="958"/>
+        <w:pStyle w:val="962"/>
         <w:numPr>
           <w:ilvl w:val="0"/>
           <w:numId w:val="13"/>
@@ -3025,7 +3025,7 @@
     </w:p>
     <w:p>
       <w:pPr>
-        <w:pStyle w:val="958"/>
+        <w:pStyle w:val="962"/>
         <w:numPr>
           <w:ilvl w:val="1"/>
           <w:numId w:val="14"/>
@@ -3052,7 +3052,7 @@
     </w:p>
     <w:p>
       <w:pPr>
-        <w:pStyle w:val="958"/>
+        <w:pStyle w:val="962"/>
         <w:numPr>
           <w:ilvl w:val="1"/>
           <w:numId w:val="14"/>
@@ -3079,7 +3079,7 @@
     </w:p>
     <w:p>
       <w:pPr>
-        <w:pStyle w:val="958"/>
+        <w:pStyle w:val="962"/>
         <w:numPr>
           <w:ilvl w:val="1"/>
           <w:numId w:val="14"/>
@@ -3106,7 +3106,7 @@
     </w:p>
     <w:p>
       <w:pPr>
-        <w:pStyle w:val="958"/>
+        <w:pStyle w:val="962"/>
         <w:numPr>
           <w:ilvl w:val="0"/>
           <w:numId w:val="15"/>
@@ -3133,7 +3133,7 @@
     </w:p>
     <w:p>
       <w:pPr>
-        <w:pStyle w:val="896"/>
+        <w:pStyle w:val="900"/>
         <w:pBdr>
           <w:top w:val="none" w:color="000000" w:sz="4" w:space="0"/>
           <w:left w:val="none" w:color="000000" w:sz="4" w:space="0"/>
@@ -3157,7 +3157,7 @@
     </w:p>
     <w:p>
       <w:pPr>
-        <w:pStyle w:val="958"/>
+        <w:pStyle w:val="962"/>
         <w:numPr>
           <w:ilvl w:val="0"/>
           <w:numId w:val="16"/>
@@ -3184,7 +3184,7 @@
     </w:p>
     <w:p>
       <w:pPr>
-        <w:pStyle w:val="958"/>
+        <w:pStyle w:val="962"/>
         <w:numPr>
           <w:ilvl w:val="0"/>
           <w:numId w:val="16"/>
@@ -3211,7 +3211,7 @@
     </w:p>
     <w:p>
       <w:pPr>
-        <w:pStyle w:val="958"/>
+        <w:pStyle w:val="962"/>
         <w:numPr>
           <w:ilvl w:val="0"/>
           <w:numId w:val="16"/>
@@ -3238,7 +3238,7 @@
     </w:p>
     <w:p>
       <w:pPr>
-        <w:pStyle w:val="958"/>
+        <w:pStyle w:val="962"/>
         <w:numPr>
           <w:ilvl w:val="0"/>
           <w:numId w:val="16"/>
@@ -3265,7 +3265,7 @@
     </w:p>
     <w:p>
       <w:pPr>
-        <w:pStyle w:val="958"/>
+        <w:pStyle w:val="962"/>
         <w:numPr>
           <w:ilvl w:val="0"/>
           <w:numId w:val="16"/>
@@ -3292,7 +3292,7 @@
     </w:p>
     <w:p>
       <w:pPr>
-        <w:pStyle w:val="958"/>
+        <w:pStyle w:val="962"/>
         <w:numPr>
           <w:ilvl w:val="1"/>
           <w:numId w:val="16"/>
@@ -3319,7 +3319,7 @@
     </w:p>
     <w:p>
       <w:pPr>
-        <w:pStyle w:val="958"/>
+        <w:pStyle w:val="962"/>
         <w:numPr>
           <w:ilvl w:val="1"/>
           <w:numId w:val="16"/>
@@ -3346,7 +3346,7 @@
     </w:p>
     <w:p>
       <w:pPr>
-        <w:pStyle w:val="958"/>
+        <w:pStyle w:val="962"/>
         <w:numPr>
           <w:ilvl w:val="1"/>
           <w:numId w:val="16"/>
@@ -3536,7 +3536,7 @@
     </w:p>
     <w:p>
       <w:pPr>
-        <w:pStyle w:val="958"/>
+        <w:pStyle w:val="962"/>
         <w:numPr>
           <w:ilvl w:val="0"/>
           <w:numId w:val="17"/>
@@ -3564,7 +3564,7 @@
     </w:p>
     <w:p>
       <w:pPr>
-        <w:pStyle w:val="958"/>
+        <w:pStyle w:val="962"/>
         <w:numPr>
           <w:ilvl w:val="0"/>
           <w:numId w:val="17"/>
@@ -3592,7 +3592,7 @@
     </w:p>
     <w:p>
       <w:pPr>
-        <w:pStyle w:val="958"/>
+        <w:pStyle w:val="962"/>
         <w:numPr>
           <w:ilvl w:val="0"/>
           <w:numId w:val="17"/>
@@ -3620,7 +3620,7 @@
     </w:p>
     <w:p>
       <w:pPr>
-        <w:pStyle w:val="958"/>
+        <w:pStyle w:val="962"/>
         <w:numPr>
           <w:ilvl w:val="0"/>
           <w:numId w:val="17"/>
@@ -3648,7 +3648,7 @@
     </w:p>
     <w:p>
       <w:pPr>
-        <w:pStyle w:val="895"/>
+        <w:pStyle w:val="899"/>
         <w:pBdr>
           <w:top w:val="none" w:color="000000" w:sz="4" w:space="0"/>
           <w:left w:val="none" w:color="000000" w:sz="4" w:space="0"/>
@@ -3672,7 +3672,7 @@
     </w:p>
     <w:p>
       <w:pPr>
-        <w:pStyle w:val="897"/>
+        <w:pStyle w:val="901"/>
         <w:pBdr>
           <w:top w:val="none" w:color="000000" w:sz="4" w:space="0"/>
           <w:left w:val="none" w:color="000000" w:sz="4" w:space="0"/>
@@ -3870,7 +3870,7 @@
     </w:p>
     <w:p>
       <w:pPr>
-        <w:pStyle w:val="897"/>
+        <w:pStyle w:val="901"/>
         <w:pBdr>
           <w:top w:val="none" w:color="000000" w:sz="4" w:space="0"/>
           <w:left w:val="none" w:color="000000" w:sz="4" w:space="0"/>
@@ -3894,7 +3894,7 @@
     </w:p>
     <w:p>
       <w:pPr>
-        <w:pStyle w:val="958"/>
+        <w:pStyle w:val="962"/>
         <w:numPr>
           <w:ilvl w:val="0"/>
           <w:numId w:val="18"/>
@@ -3930,7 +3930,7 @@
     </w:p>
     <w:p>
       <w:pPr>
-        <w:pStyle w:val="958"/>
+        <w:pStyle w:val="962"/>
         <w:numPr>
           <w:ilvl w:val="0"/>
           <w:numId w:val="18"/>
@@ -3966,7 +3966,7 @@
     </w:p>
     <w:p>
       <w:pPr>
-        <w:pStyle w:val="958"/>
+        <w:pStyle w:val="962"/>
         <w:numPr>
           <w:ilvl w:val="0"/>
           <w:numId w:val="18"/>
@@ -4002,7 +4002,7 @@
     </w:p>
     <w:p>
       <w:pPr>
-        <w:pStyle w:val="958"/>
+        <w:pStyle w:val="962"/>
         <w:numPr>
           <w:ilvl w:val="0"/>
           <w:numId w:val="18"/>
@@ -4038,7 +4038,7 @@
     </w:p>
     <w:p>
       <w:pPr>
-        <w:pStyle w:val="958"/>
+        <w:pStyle w:val="962"/>
         <w:numPr>
           <w:ilvl w:val="0"/>
           <w:numId w:val="18"/>
@@ -4074,7 +4074,7 @@
     </w:p>
     <w:p>
       <w:pPr>
-        <w:pStyle w:val="958"/>
+        <w:pStyle w:val="962"/>
         <w:numPr>
           <w:ilvl w:val="0"/>
           <w:numId w:val="18"/>
@@ -4110,7 +4110,7 @@
     </w:p>
     <w:p>
       <w:pPr>
-        <w:pStyle w:val="895"/>
+        <w:pStyle w:val="899"/>
         <w:pBdr>
           <w:top w:val="none" w:color="000000" w:sz="4" w:space="0"/>
           <w:left w:val="none" w:color="000000" w:sz="4" w:space="0"/>
@@ -4352,7 +4352,7 @@
     </w:p>
     <w:p>
       <w:pPr>
-        <w:pStyle w:val="896"/>
+        <w:pStyle w:val="900"/>
         <w:pBdr>
           <w:top w:val="none" w:color="000000" w:sz="4" w:space="0"/>
           <w:left w:val="none" w:color="000000" w:sz="4" w:space="0"/>
@@ -4407,7 +4407,7 @@
     </w:p>
     <w:p>
       <w:pPr>
-        <w:pStyle w:val="897"/>
+        <w:pStyle w:val="901"/>
         <w:pBdr>
           <w:top w:val="none" w:color="000000" w:sz="4" w:space="0"/>
           <w:left w:val="none" w:color="000000" w:sz="4" w:space="0"/>
@@ -4431,7 +4431,7 @@
     </w:p>
     <w:p>
       <w:pPr>
-        <w:pStyle w:val="958"/>
+        <w:pStyle w:val="962"/>
         <w:numPr>
           <w:ilvl w:val="0"/>
           <w:numId w:val="19"/>
@@ -4458,7 +4458,7 @@
     </w:p>
     <w:p>
       <w:pPr>
-        <w:pStyle w:val="958"/>
+        <w:pStyle w:val="962"/>
         <w:numPr>
           <w:ilvl w:val="0"/>
           <w:numId w:val="19"/>
@@ -4485,7 +4485,7 @@
     </w:p>
     <w:p>
       <w:pPr>
-        <w:pStyle w:val="958"/>
+        <w:pStyle w:val="962"/>
         <w:numPr>
           <w:ilvl w:val="0"/>
           <w:numId w:val="19"/>
@@ -4512,7 +4512,7 @@
     </w:p>
     <w:p>
       <w:pPr>
-        <w:pStyle w:val="958"/>
+        <w:pStyle w:val="962"/>
         <w:numPr>
           <w:ilvl w:val="0"/>
           <w:numId w:val="19"/>
@@ -4539,7 +4539,7 @@
     </w:p>
     <w:p>
       <w:pPr>
-        <w:pStyle w:val="896"/>
+        <w:pStyle w:val="900"/>
         <w:pBdr>
           <w:top w:val="none" w:color="000000" w:sz="4" w:space="0"/>
           <w:left w:val="none" w:color="000000" w:sz="4" w:space="0"/>
@@ -4594,7 +4594,7 @@
     </w:p>
     <w:p>
       <w:pPr>
-        <w:pStyle w:val="897"/>
+        <w:pStyle w:val="901"/>
         <w:pBdr>
           <w:top w:val="none" w:color="000000" w:sz="4" w:space="0"/>
           <w:left w:val="none" w:color="000000" w:sz="4" w:space="0"/>
@@ -4618,7 +4618,7 @@
     </w:p>
     <w:p>
       <w:pPr>
-        <w:pStyle w:val="958"/>
+        <w:pStyle w:val="962"/>
         <w:numPr>
           <w:ilvl w:val="0"/>
           <w:numId w:val="20"/>
@@ -4645,7 +4645,7 @@
     </w:p>
     <w:p>
       <w:pPr>
-        <w:pStyle w:val="958"/>
+        <w:pStyle w:val="962"/>
         <w:numPr>
           <w:ilvl w:val="0"/>
           <w:numId w:val="20"/>
@@ -4672,7 +4672,7 @@
     </w:p>
     <w:p>
       <w:pPr>
-        <w:pStyle w:val="958"/>
+        <w:pStyle w:val="962"/>
         <w:numPr>
           <w:ilvl w:val="0"/>
           <w:numId w:val="20"/>
@@ -4699,7 +4699,7 @@
     </w:p>
     <w:p>
       <w:pPr>
-        <w:pStyle w:val="958"/>
+        <w:pStyle w:val="962"/>
         <w:numPr>
           <w:ilvl w:val="0"/>
           <w:numId w:val="20"/>
@@ -4726,7 +4726,7 @@
     </w:p>
     <w:p>
       <w:pPr>
-        <w:pStyle w:val="896"/>
+        <w:pStyle w:val="900"/>
         <w:pBdr>
           <w:top w:val="none" w:color="000000" w:sz="4" w:space="0"/>
           <w:left w:val="none" w:color="000000" w:sz="4" w:space="0"/>
@@ -4781,7 +4781,7 @@
     </w:p>
     <w:p>
       <w:pPr>
-        <w:pStyle w:val="897"/>
+        <w:pStyle w:val="901"/>
         <w:pBdr>
           <w:top w:val="none" w:color="000000" w:sz="4" w:space="0"/>
           <w:left w:val="none" w:color="000000" w:sz="4" w:space="0"/>
@@ -4805,7 +4805,7 @@
     </w:p>
     <w:p>
       <w:pPr>
-        <w:pStyle w:val="958"/>
+        <w:pStyle w:val="962"/>
         <w:numPr>
           <w:ilvl w:val="0"/>
           <w:numId w:val="21"/>
@@ -4832,7 +4832,7 @@
     </w:p>
     <w:p>
       <w:pPr>
-        <w:pStyle w:val="958"/>
+        <w:pStyle w:val="962"/>
         <w:numPr>
           <w:ilvl w:val="0"/>
           <w:numId w:val="21"/>
@@ -4859,7 +4859,7 @@
     </w:p>
     <w:p>
       <w:pPr>
-        <w:pStyle w:val="958"/>
+        <w:pStyle w:val="962"/>
         <w:numPr>
           <w:ilvl w:val="0"/>
           <w:numId w:val="21"/>
@@ -4886,7 +4886,7 @@
     </w:p>
     <w:p>
       <w:pPr>
-        <w:pStyle w:val="958"/>
+        <w:pStyle w:val="962"/>
         <w:numPr>
           <w:ilvl w:val="0"/>
           <w:numId w:val="21"/>
@@ -4913,7 +4913,7 @@
     </w:p>
     <w:p>
       <w:pPr>
-        <w:pStyle w:val="958"/>
+        <w:pStyle w:val="962"/>
         <w:numPr>
           <w:ilvl w:val="0"/>
           <w:numId w:val="21"/>
@@ -4940,7 +4940,7 @@
     </w:p>
     <w:p>
       <w:pPr>
-        <w:pStyle w:val="896"/>
+        <w:pStyle w:val="900"/>
         <w:pBdr>
           <w:top w:val="none" w:color="000000" w:sz="4" w:space="0"/>
           <w:left w:val="none" w:color="000000" w:sz="4" w:space="0"/>
@@ -4995,7 +4995,7 @@
     </w:p>
     <w:p>
       <w:pPr>
-        <w:pStyle w:val="897"/>
+        <w:pStyle w:val="901"/>
         <w:pBdr>
           <w:top w:val="none" w:color="000000" w:sz="4" w:space="0"/>
           <w:left w:val="none" w:color="000000" w:sz="4" w:space="0"/>
@@ -5019,7 +5019,7 @@
     </w:p>
     <w:p>
       <w:pPr>
-        <w:pStyle w:val="958"/>
+        <w:pStyle w:val="962"/>
         <w:numPr>
           <w:ilvl w:val="0"/>
           <w:numId w:val="22"/>
@@ -5046,7 +5046,7 @@
     </w:p>
     <w:p>
       <w:pPr>
-        <w:pStyle w:val="958"/>
+        <w:pStyle w:val="962"/>
         <w:numPr>
           <w:ilvl w:val="0"/>
           <w:numId w:val="22"/>
@@ -5073,7 +5073,7 @@
     </w:p>
     <w:p>
       <w:pPr>
-        <w:pStyle w:val="958"/>
+        <w:pStyle w:val="962"/>
         <w:numPr>
           <w:ilvl w:val="0"/>
           <w:numId w:val="22"/>
@@ -5100,7 +5100,7 @@
     </w:p>
     <w:p>
       <w:pPr>
-        <w:pStyle w:val="958"/>
+        <w:pStyle w:val="962"/>
         <w:numPr>
           <w:ilvl w:val="0"/>
           <w:numId w:val="22"/>
@@ -5127,7 +5127,7 @@
     </w:p>
     <w:p>
       <w:pPr>
-        <w:pStyle w:val="958"/>
+        <w:pStyle w:val="962"/>
         <w:numPr>
           <w:ilvl w:val="0"/>
           <w:numId w:val="22"/>
@@ -5154,7 +5154,7 @@
     </w:p>
     <w:p>
       <w:pPr>
-        <w:pStyle w:val="896"/>
+        <w:pStyle w:val="900"/>
         <w:pBdr>
           <w:top w:val="none" w:color="000000" w:sz="4" w:space="0"/>
           <w:left w:val="none" w:color="000000" w:sz="4" w:space="0"/>
@@ -5209,7 +5209,7 @@
     </w:p>
     <w:p>
       <w:pPr>
-        <w:pStyle w:val="896"/>
+        <w:pStyle w:val="900"/>
         <w:pBdr>
           <w:top w:val="none" w:color="000000" w:sz="4" w:space="0"/>
           <w:left w:val="none" w:color="000000" w:sz="4" w:space="0"/>
@@ -5264,7 +5264,7 @@
     </w:p>
     <w:p>
       <w:pPr>
-        <w:pStyle w:val="896"/>
+        <w:pStyle w:val="900"/>
         <w:pBdr>
           <w:top w:val="none" w:color="000000" w:sz="4" w:space="0"/>
           <w:left w:val="none" w:color="000000" w:sz="4" w:space="0"/>
@@ -5319,7 +5319,7 @@
     </w:p>
     <w:p>
       <w:pPr>
-        <w:pStyle w:val="958"/>
+        <w:pStyle w:val="962"/>
         <w:numPr>
           <w:ilvl w:val="0"/>
           <w:numId w:val="23"/>
@@ -5346,7 +5346,7 @@
     </w:p>
     <w:p>
       <w:pPr>
-        <w:pStyle w:val="958"/>
+        <w:pStyle w:val="962"/>
         <w:numPr>
           <w:ilvl w:val="0"/>
           <w:numId w:val="23"/>
@@ -5373,7 +5373,7 @@
     </w:p>
     <w:p>
       <w:pPr>
-        <w:pStyle w:val="958"/>
+        <w:pStyle w:val="962"/>
         <w:numPr>
           <w:ilvl w:val="0"/>
           <w:numId w:val="23"/>
@@ -5400,7 +5400,7 @@
     </w:p>
     <w:p>
       <w:pPr>
-        <w:pStyle w:val="958"/>
+        <w:pStyle w:val="962"/>
         <w:numPr>
           <w:ilvl w:val="0"/>
           <w:numId w:val="23"/>
@@ -5427,7 +5427,7 @@
     </w:p>
     <w:p>
       <w:pPr>
-        <w:pStyle w:val="958"/>
+        <w:pStyle w:val="962"/>
         <w:numPr>
           <w:ilvl w:val="0"/>
           <w:numId w:val="23"/>
@@ -5454,7 +5454,7 @@
     </w:p>
     <w:p>
       <w:pPr>
-        <w:pStyle w:val="958"/>
+        <w:pStyle w:val="962"/>
         <w:numPr>
           <w:ilvl w:val="0"/>
           <w:numId w:val="23"/>
@@ -5481,7 +5481,7 @@
     </w:p>
     <w:p>
       <w:pPr>
-        <w:pStyle w:val="895"/>
+        <w:pStyle w:val="899"/>
         <w:pBdr>
           <w:top w:val="none" w:color="000000" w:sz="4" w:space="0"/>
           <w:left w:val="none" w:color="000000" w:sz="4" w:space="0"/>
@@ -6053,7 +6053,7 @@
     </w:p>
     <w:p>
       <w:pPr>
-        <w:pStyle w:val="895"/>
+        <w:pStyle w:val="899"/>
         <w:pBdr>
           <w:top w:val="none" w:color="000000" w:sz="4" w:space="0"/>
           <w:left w:val="none" w:color="000000" w:sz="4" w:space="0"/>
@@ -6077,7 +6077,7 @@
     </w:p>
     <w:p>
       <w:pPr>
-        <w:pStyle w:val="896"/>
+        <w:pStyle w:val="900"/>
         <w:pBdr>
           <w:top w:val="none" w:color="000000" w:sz="4" w:space="0"/>
           <w:left w:val="none" w:color="000000" w:sz="4" w:space="0"/>
@@ -6101,7 +6101,7 @@
     </w:p>
     <w:p>
       <w:pPr>
-        <w:pStyle w:val="897"/>
+        <w:pStyle w:val="901"/>
         <w:pBdr>
           <w:top w:val="none" w:color="000000" w:sz="4" w:space="0"/>
           <w:left w:val="none" w:color="000000" w:sz="4" w:space="0"/>
@@ -6299,7 +6299,7 @@
     </w:p>
     <w:p>
       <w:pPr>
-        <w:pStyle w:val="897"/>
+        <w:pStyle w:val="901"/>
         <w:pBdr>
           <w:top w:val="none" w:color="000000" w:sz="4" w:space="0"/>
           <w:left w:val="none" w:color="000000" w:sz="4" w:space="0"/>
@@ -6323,7 +6323,7 @@
     </w:p>
     <w:p>
       <w:pPr>
-        <w:pStyle w:val="958"/>
+        <w:pStyle w:val="962"/>
         <w:numPr>
           <w:ilvl w:val="0"/>
           <w:numId w:val="24"/>
@@ -6503,7 +6503,7 @@
     </w:p>
     <w:p>
       <w:pPr>
-        <w:pStyle w:val="958"/>
+        <w:pStyle w:val="962"/>
         <w:numPr>
           <w:ilvl w:val="0"/>
           <w:numId w:val="25"/>
@@ -6705,7 +6705,7 @@
     </w:p>
     <w:p>
       <w:pPr>
-        <w:pStyle w:val="958"/>
+        <w:pStyle w:val="962"/>
         <w:numPr>
           <w:ilvl w:val="0"/>
           <w:numId w:val="26"/>
@@ -6733,7 +6733,7 @@
     </w:p>
     <w:p>
       <w:pPr>
-        <w:pStyle w:val="958"/>
+        <w:pStyle w:val="962"/>
         <w:numPr>
           <w:ilvl w:val="0"/>
           <w:numId w:val="27"/>
@@ -6760,7 +6760,7 @@
     </w:p>
     <w:p>
       <w:pPr>
-        <w:pStyle w:val="958"/>
+        <w:pStyle w:val="962"/>
         <w:numPr>
           <w:ilvl w:val="1"/>
           <w:numId w:val="27"/>
@@ -6787,7 +6787,7 @@
     </w:p>
     <w:p>
       <w:pPr>
-        <w:pStyle w:val="958"/>
+        <w:pStyle w:val="962"/>
         <w:numPr>
           <w:ilvl w:val="1"/>
           <w:numId w:val="27"/>
@@ -6814,7 +6814,7 @@
     </w:p>
     <w:p>
       <w:pPr>
-        <w:pStyle w:val="958"/>
+        <w:pStyle w:val="962"/>
         <w:numPr>
           <w:ilvl w:val="1"/>
           <w:numId w:val="27"/>
@@ -6841,7 +6841,7 @@
     </w:p>
     <w:p>
       <w:pPr>
-        <w:pStyle w:val="896"/>
+        <w:pStyle w:val="900"/>
         <w:pBdr>
           <w:top w:val="none" w:color="000000" w:sz="4" w:space="0"/>
           <w:left w:val="none" w:color="000000" w:sz="4" w:space="0"/>
@@ -6888,7 +6888,7 @@
     </w:p>
     <w:p>
       <w:pPr>
-        <w:pStyle w:val="958"/>
+        <w:pStyle w:val="962"/>
         <w:numPr>
           <w:ilvl w:val="0"/>
           <w:numId w:val="28"/>
@@ -6915,7 +6915,7 @@
     </w:p>
     <w:p>
       <w:pPr>
-        <w:pStyle w:val="958"/>
+        <w:pStyle w:val="962"/>
         <w:numPr>
           <w:ilvl w:val="0"/>
           <w:numId w:val="28"/>
@@ -6942,7 +6942,7 @@
     </w:p>
     <w:p>
       <w:pPr>
-        <w:pStyle w:val="958"/>
+        <w:pStyle w:val="962"/>
         <w:numPr>
           <w:ilvl w:val="0"/>
           <w:numId w:val="28"/>
@@ -7077,7 +7077,7 @@
     </w:p>
     <w:p>
       <w:pPr>
-        <w:pStyle w:val="896"/>
+        <w:pStyle w:val="900"/>
         <w:pBdr>
           <w:top w:val="none" w:color="000000" w:sz="4" w:space="0"/>
           <w:left w:val="none" w:color="000000" w:sz="4" w:space="0"/>
@@ -7254,7 +7254,7 @@
     </w:p>
     <w:p>
       <w:pPr>
-        <w:pStyle w:val="958"/>
+        <w:pStyle w:val="962"/>
         <w:numPr>
           <w:ilvl w:val="0"/>
           <w:numId w:val="29"/>
@@ -7281,7 +7281,7 @@
     </w:p>
     <w:p>
       <w:pPr>
-        <w:pStyle w:val="958"/>
+        <w:pStyle w:val="962"/>
         <w:numPr>
           <w:ilvl w:val="0"/>
           <w:numId w:val="29"/>
@@ -7308,7 +7308,7 @@
     </w:p>
     <w:p>
       <w:pPr>
-        <w:pStyle w:val="896"/>
+        <w:pStyle w:val="900"/>
         <w:pBdr>
           <w:top w:val="none" w:color="000000" w:sz="4" w:space="0"/>
           <w:left w:val="none" w:color="000000" w:sz="4" w:space="0"/>
@@ -7485,7 +7485,7 @@
     </w:p>
     <w:p>
       <w:pPr>
-        <w:pStyle w:val="958"/>
+        <w:pStyle w:val="962"/>
         <w:numPr>
           <w:ilvl w:val="0"/>
           <w:numId w:val="30"/>
@@ -7512,7 +7512,7 @@
     </w:p>
     <w:p>
       <w:pPr>
-        <w:pStyle w:val="958"/>
+        <w:pStyle w:val="962"/>
         <w:numPr>
           <w:ilvl w:val="0"/>
           <w:numId w:val="30"/>
@@ -7539,7 +7539,7 @@
     </w:p>
     <w:p>
       <w:pPr>
-        <w:pStyle w:val="896"/>
+        <w:pStyle w:val="900"/>
         <w:pBdr>
           <w:top w:val="none" w:color="000000" w:sz="4" w:space="0"/>
           <w:left w:val="none" w:color="000000" w:sz="4" w:space="0"/>
@@ -7563,7 +7563,7 @@
     </w:p>
     <w:p>
       <w:pPr>
-        <w:pStyle w:val="897"/>
+        <w:pStyle w:val="901"/>
         <w:pBdr>
           <w:top w:val="none" w:color="000000" w:sz="4" w:space="0"/>
           <w:left w:val="none" w:color="000000" w:sz="4" w:space="0"/>
@@ -7587,7 +7587,7 @@
     </w:p>
     <w:p>
       <w:pPr>
-        <w:pStyle w:val="958"/>
+        <w:pStyle w:val="962"/>
         <w:numPr>
           <w:ilvl w:val="0"/>
           <w:numId w:val="31"/>
@@ -7614,7 +7614,7 @@
     </w:p>
     <w:p>
       <w:pPr>
-        <w:pStyle w:val="958"/>
+        <w:pStyle w:val="962"/>
         <w:numPr>
           <w:ilvl w:val="0"/>
           <w:numId w:val="31"/>
@@ -7641,7 +7641,7 @@
     </w:p>
     <w:p>
       <w:pPr>
-        <w:pStyle w:val="958"/>
+        <w:pStyle w:val="962"/>
         <w:numPr>
           <w:ilvl w:val="0"/>
           <w:numId w:val="31"/>
@@ -7668,7 +7668,7 @@
     </w:p>
     <w:p>
       <w:pPr>
-        <w:pStyle w:val="958"/>
+        <w:pStyle w:val="962"/>
         <w:numPr>
           <w:ilvl w:val="0"/>
           <w:numId w:val="31"/>
@@ -7695,7 +7695,7 @@
     </w:p>
     <w:p>
       <w:pPr>
-        <w:pStyle w:val="897"/>
+        <w:pStyle w:val="901"/>
         <w:pBdr>
           <w:top w:val="none" w:color="000000" w:sz="4" w:space="0"/>
           <w:left w:val="none" w:color="000000" w:sz="4" w:space="0"/>
@@ -7893,7 +7893,7 @@
     </w:p>
     <w:p>
       <w:pPr>
-        <w:pStyle w:val="896"/>
+        <w:pStyle w:val="900"/>
         <w:pBdr>
           <w:top w:val="none" w:color="000000" w:sz="4" w:space="0"/>
           <w:left w:val="none" w:color="000000" w:sz="4" w:space="0"/>
@@ -7940,7 +7940,7 @@
     </w:p>
     <w:p>
       <w:pPr>
-        <w:pStyle w:val="958"/>
+        <w:pStyle w:val="962"/>
         <w:numPr>
           <w:ilvl w:val="0"/>
           <w:numId w:val="32"/>
@@ -8075,7 +8075,7 @@
     </w:p>
     <w:p>
       <w:pPr>
-        <w:pStyle w:val="896"/>
+        <w:pStyle w:val="900"/>
         <w:pBdr>
           <w:top w:val="none" w:color="000000" w:sz="4" w:space="0"/>
           <w:left w:val="none" w:color="000000" w:sz="4" w:space="0"/>
@@ -8229,7 +8229,7 @@
     </w:p>
     <w:p>
       <w:pPr>
-        <w:pStyle w:val="896"/>
+        <w:pStyle w:val="900"/>
         <w:pBdr>
           <w:top w:val="none" w:color="000000" w:sz="4" w:space="0"/>
           <w:left w:val="none" w:color="000000" w:sz="4" w:space="0"/>
@@ -8361,7 +8361,7 @@
     </w:p>
     <w:p>
       <w:pPr>
-        <w:pStyle w:val="895"/>
+        <w:pStyle w:val="899"/>
         <w:pBdr>
           <w:top w:val="none" w:color="000000" w:sz="4" w:space="0"/>
           <w:left w:val="none" w:color="000000" w:sz="4" w:space="0"/>
@@ -8407,7 +8407,7 @@
     </w:p>
     <w:p>
       <w:pPr>
-        <w:pStyle w:val="958"/>
+        <w:pStyle w:val="962"/>
         <w:numPr>
           <w:ilvl w:val="0"/>
           <w:numId w:val="33"/>
@@ -8434,7 +8434,7 @@
     </w:p>
     <w:p>
       <w:pPr>
-        <w:pStyle w:val="958"/>
+        <w:pStyle w:val="962"/>
         <w:numPr>
           <w:ilvl w:val="0"/>
           <w:numId w:val="33"/>
@@ -8461,7 +8461,7 @@
     </w:p>
     <w:p>
       <w:pPr>
-        <w:pStyle w:val="958"/>
+        <w:pStyle w:val="962"/>
         <w:numPr>
           <w:ilvl w:val="0"/>
           <w:numId w:val="33"/>
@@ -8488,7 +8488,7 @@
     </w:p>
     <w:p>
       <w:pPr>
-        <w:pStyle w:val="958"/>
+        <w:pStyle w:val="962"/>
         <w:numPr>
           <w:ilvl w:val="0"/>
           <w:numId w:val="33"/>
@@ -8554,7 +8554,7 @@
     </w:p>
     <w:p>
       <w:pPr>
-        <w:pStyle w:val="895"/>
+        <w:pStyle w:val="899"/>
         <w:pBdr>
           <w:top w:val="none" w:color="000000" w:sz="4" w:space="0"/>
           <w:left w:val="none" w:color="000000" w:sz="4" w:space="0"/>
@@ -8769,7 +8769,7 @@
     </w:p>
     <w:p>
       <w:pPr>
-        <w:pStyle w:val="958"/>
+        <w:pStyle w:val="962"/>
         <w:numPr>
           <w:ilvl w:val="0"/>
           <w:numId w:val="34"/>
@@ -8796,7 +8796,7 @@
     </w:p>
     <w:p>
       <w:pPr>
-        <w:pStyle w:val="958"/>
+        <w:pStyle w:val="962"/>
         <w:numPr>
           <w:ilvl w:val="0"/>
           <w:numId w:val="34"/>
@@ -8823,7 +8823,7 @@
     </w:p>
     <w:p>
       <w:pPr>
-        <w:pStyle w:val="895"/>
+        <w:pStyle w:val="899"/>
         <w:pBdr>
           <w:top w:val="none" w:color="000000" w:sz="4" w:space="0"/>
           <w:left w:val="none" w:color="000000" w:sz="4" w:space="0"/>
@@ -8869,7 +8869,7 @@
     </w:p>
     <w:p>
       <w:pPr>
-        <w:pStyle w:val="958"/>
+        <w:pStyle w:val="962"/>
         <w:numPr>
           <w:ilvl w:val="0"/>
           <w:numId w:val="35"/>
@@ -8897,7 +8897,7 @@
     </w:p>
     <w:p>
       <w:pPr>
-        <w:pStyle w:val="958"/>
+        <w:pStyle w:val="962"/>
         <w:numPr>
           <w:ilvl w:val="0"/>
           <w:numId w:val="35"/>
@@ -8925,7 +8925,7 @@
     </w:p>
     <w:p>
       <w:pPr>
-        <w:pStyle w:val="958"/>
+        <w:pStyle w:val="962"/>
         <w:numPr>
           <w:ilvl w:val="0"/>
           <w:numId w:val="35"/>
@@ -8953,7 +8953,7 @@
     </w:p>
     <w:p>
       <w:pPr>
-        <w:pStyle w:val="958"/>
+        <w:pStyle w:val="962"/>
         <w:numPr>
           <w:ilvl w:val="0"/>
           <w:numId w:val="35"/>
@@ -14426,9 +14426,9 @@
     <w:lsdException w:name="Bibliography" w:uiPriority="37"/>
     <w:lsdException w:name="TOC Heading" w:uiPriority="39" w:qFormat="1"/>
   </w:latentStyles>
-  <w:style w:type="table" w:styleId="769">
+  <w:style w:type="table" w:styleId="773">
     <w:name w:val="Table Grid"/>
-    <w:basedOn w:val="955"/>
+    <w:basedOn w:val="959"/>
     <w:uiPriority w:val="59"/>
     <w:pPr>
       <w:pBdr/>
@@ -14437,6 +14437,12 @@
     </w:pPr>
     <w:tblPr>
       <w:tblInd w:w="0" w:type="dxa"/>
+      <w:tblCellMar>
+        <w:left w:w="108" w:type="dxa"/>
+        <w:top w:w="0" w:type="dxa"/>
+        <w:right w:w="108" w:type="dxa"/>
+        <w:bottom w:w="0" w:type="dxa"/>
+      </w:tblCellMar>
       <w:tblBorders>
         <w:top w:val="single" w:color="000000" w:sz="4" w:space="0"/>
         <w:left w:val="single" w:color="000000" w:sz="4" w:space="0"/>
@@ -14445,12 +14451,6 @@
         <w:insideH w:val="single" w:color="000000" w:sz="4" w:space="0"/>
         <w:insideV w:val="single" w:color="000000" w:sz="4" w:space="0"/>
       </w:tblBorders>
-      <w:tblCellMar>
-        <w:left w:w="108" w:type="dxa"/>
-        <w:top w:w="0" w:type="dxa"/>
-        <w:right w:w="108" w:type="dxa"/>
-        <w:bottom w:w="0" w:type="dxa"/>
-      </w:tblCellMar>
     </w:tblPr>
     <w:tcPr>
       <w:tcBorders/>
@@ -14625,9 +14625,9 @@
       </w:tcPr>
     </w:tblStylePr>
   </w:style>
-  <w:style w:type="table" w:styleId="770">
+  <w:style w:type="table" w:styleId="774">
     <w:name w:val="Table Grid Light"/>
-    <w:basedOn w:val="955"/>
+    <w:basedOn w:val="959"/>
     <w:uiPriority w:val="59"/>
     <w:pPr>
       <w:pBdr/>
@@ -14636,6 +14636,12 @@
     </w:pPr>
     <w:tblPr>
       <w:tblInd w:w="0" w:type="dxa"/>
+      <w:tblCellMar>
+        <w:left w:w="108" w:type="dxa"/>
+        <w:top w:w="0" w:type="dxa"/>
+        <w:right w:w="108" w:type="dxa"/>
+        <w:bottom w:w="0" w:type="dxa"/>
+      </w:tblCellMar>
       <w:tblBorders>
         <w:top w:val="single" w:color="000000" w:themeColor="text1" w:themeTint="50" w:sz="4" w:space="0"/>
         <w:left w:val="single" w:color="000000" w:themeColor="text1" w:themeTint="50" w:sz="4" w:space="0"/>
@@ -14644,12 +14650,6 @@
         <w:insideH w:val="single" w:color="000000" w:themeColor="text1" w:themeTint="50" w:sz="4" w:space="0"/>
         <w:insideV w:val="single" w:color="000000" w:themeColor="text1" w:themeTint="50" w:sz="4" w:space="0"/>
       </w:tblBorders>
-      <w:tblCellMar>
-        <w:left w:w="108" w:type="dxa"/>
-        <w:top w:w="0" w:type="dxa"/>
-        <w:right w:w="108" w:type="dxa"/>
-        <w:bottom w:w="0" w:type="dxa"/>
-      </w:tblCellMar>
     </w:tblPr>
     <w:tcPr>
       <w:tcBorders/>
@@ -14824,9 +14824,9 @@
       </w:tcPr>
     </w:tblStylePr>
   </w:style>
-  <w:style w:type="table" w:styleId="771">
+  <w:style w:type="table" w:styleId="775">
     <w:name w:val="Plain Table 1"/>
-    <w:basedOn w:val="955"/>
+    <w:basedOn w:val="959"/>
     <w:uiPriority w:val="59"/>
     <w:pPr>
       <w:pBdr/>
@@ -14835,6 +14835,12 @@
     </w:pPr>
     <w:tblPr>
       <w:tblInd w:w="0" w:type="dxa"/>
+      <w:tblCellMar>
+        <w:left w:w="108" w:type="dxa"/>
+        <w:top w:w="0" w:type="dxa"/>
+        <w:right w:w="108" w:type="dxa"/>
+        <w:bottom w:w="0" w:type="dxa"/>
+      </w:tblCellMar>
       <w:tblBorders>
         <w:top w:val="single" w:color="000000" w:themeColor="text1" w:themeTint="50" w:sz="4" w:space="0"/>
         <w:left w:val="single" w:color="000000" w:themeColor="text1" w:themeTint="50" w:sz="4" w:space="0"/>
@@ -14843,12 +14849,6 @@
         <w:insideH w:val="single" w:color="000000" w:themeColor="text1" w:themeTint="50" w:sz="4" w:space="0"/>
         <w:insideV w:val="single" w:color="000000" w:themeColor="text1" w:themeTint="50" w:sz="4" w:space="0"/>
       </w:tblBorders>
-      <w:tblCellMar>
-        <w:left w:w="108" w:type="dxa"/>
-        <w:top w:w="0" w:type="dxa"/>
-        <w:right w:w="108" w:type="dxa"/>
-        <w:bottom w:w="0" w:type="dxa"/>
-      </w:tblCellMar>
     </w:tblPr>
     <w:tcPr>
       <w:tcBorders/>
@@ -15049,9 +15049,9 @@
       </w:tcPr>
     </w:tblStylePr>
   </w:style>
-  <w:style w:type="table" w:styleId="772">
+  <w:style w:type="table" w:styleId="776">
     <w:name w:val="Plain Table 2"/>
-    <w:basedOn w:val="955"/>
+    <w:basedOn w:val="959"/>
     <w:uiPriority w:val="59"/>
     <w:pPr>
       <w:pBdr/>
@@ -15060,18 +15060,18 @@
     </w:pPr>
     <w:tblPr>
       <w:tblInd w:w="0" w:type="dxa"/>
+      <w:tblCellMar>
+        <w:left w:w="108" w:type="dxa"/>
+        <w:top w:w="0" w:type="dxa"/>
+        <w:right w:w="108" w:type="dxa"/>
+        <w:bottom w:w="0" w:type="dxa"/>
+      </w:tblCellMar>
       <w:tblBorders>
         <w:top w:val="single" w:color="000000" w:themeColor="text1" w:sz="4" w:space="0"/>
         <w:left w:val="none" w:color="000000" w:themeColor="text1" w:sz="4" w:space="0"/>
         <w:bottom w:val="single" w:color="000000" w:themeColor="text1" w:sz="4" w:space="0"/>
         <w:right w:val="none" w:color="000000" w:themeColor="text1" w:sz="4" w:space="0"/>
       </w:tblBorders>
-      <w:tblCellMar>
-        <w:left w:w="108" w:type="dxa"/>
-        <w:top w:w="0" w:type="dxa"/>
-        <w:right w:w="108" w:type="dxa"/>
-        <w:bottom w:w="0" w:type="dxa"/>
-      </w:tblCellMar>
     </w:tblPr>
     <w:tcPr>
       <w:tcBorders/>
@@ -15282,9 +15282,9 @@
       </w:tcPr>
     </w:tblStylePr>
   </w:style>
-  <w:style w:type="table" w:styleId="773">
+  <w:style w:type="table" w:styleId="777">
     <w:name w:val="Plain Table 3"/>
-    <w:basedOn w:val="955"/>
+    <w:basedOn w:val="959"/>
     <w:uiPriority w:val="99"/>
     <w:pPr>
       <w:pBdr/>
@@ -15512,9 +15512,9 @@
       </w:tcPr>
     </w:tblStylePr>
   </w:style>
-  <w:style w:type="table" w:styleId="774">
+  <w:style w:type="table" w:styleId="778">
     <w:name w:val="Plain Table 4"/>
-    <w:basedOn w:val="955"/>
+    <w:basedOn w:val="959"/>
     <w:uiPriority w:val="99"/>
     <w:pPr>
       <w:pBdr/>
@@ -15728,9 +15728,9 @@
       </w:tcPr>
     </w:tblStylePr>
   </w:style>
-  <w:style w:type="table" w:styleId="775">
+  <w:style w:type="table" w:styleId="779">
     <w:name w:val="Plain Table 5"/>
-    <w:basedOn w:val="955"/>
+    <w:basedOn w:val="959"/>
     <w:uiPriority w:val="99"/>
     <w:pPr>
       <w:pBdr/>
@@ -15961,9 +15961,9 @@
       </w:tcPr>
     </w:tblStylePr>
   </w:style>
-  <w:style w:type="table" w:styleId="776">
+  <w:style w:type="table" w:styleId="780">
     <w:name w:val="Grid Table 1 Light"/>
-    <w:basedOn w:val="955"/>
+    <w:basedOn w:val="959"/>
     <w:uiPriority w:val="99"/>
     <w:pPr>
       <w:pBdr/>
@@ -16184,9 +16184,9 @@
       </w:tcPr>
     </w:tblStylePr>
   </w:style>
-  <w:style w:type="table" w:styleId="777">
+  <w:style w:type="table" w:styleId="781">
     <w:name w:val="Grid Table 1 Light - Accent 1"/>
-    <w:basedOn w:val="955"/>
+    <w:basedOn w:val="959"/>
     <w:uiPriority w:val="99"/>
     <w:pPr>
       <w:pBdr/>
@@ -16407,9 +16407,9 @@
       </w:tcPr>
     </w:tblStylePr>
   </w:style>
-  <w:style w:type="table" w:styleId="778">
+  <w:style w:type="table" w:styleId="782">
     <w:name w:val="Grid Table 1 Light - Accent 2"/>
-    <w:basedOn w:val="955"/>
+    <w:basedOn w:val="959"/>
     <w:uiPriority w:val="99"/>
     <w:pPr>
       <w:pBdr/>
@@ -16630,9 +16630,9 @@
       </w:tcPr>
     </w:tblStylePr>
   </w:style>
-  <w:style w:type="table" w:styleId="779">
+  <w:style w:type="table" w:styleId="783">
     <w:name w:val="Grid Table 1 Light - Accent 3"/>
-    <w:basedOn w:val="955"/>
+    <w:basedOn w:val="959"/>
     <w:uiPriority w:val="99"/>
     <w:pPr>
       <w:pBdr/>
@@ -16853,9 +16853,9 @@
       </w:tcPr>
     </w:tblStylePr>
   </w:style>
-  <w:style w:type="table" w:styleId="780">
+  <w:style w:type="table" w:styleId="784">
     <w:name w:val="Grid Table 1 Light - Accent 4"/>
-    <w:basedOn w:val="955"/>
+    <w:basedOn w:val="959"/>
     <w:uiPriority w:val="99"/>
     <w:pPr>
       <w:pBdr/>
@@ -17076,9 +17076,9 @@
       </w:tcPr>
     </w:tblStylePr>
   </w:style>
-  <w:style w:type="table" w:styleId="781">
+  <w:style w:type="table" w:styleId="785">
     <w:name w:val="Grid Table 1 Light - Accent 5"/>
-    <w:basedOn w:val="955"/>
+    <w:basedOn w:val="959"/>
     <w:uiPriority w:val="99"/>
     <w:pPr>
       <w:pBdr/>
@@ -17299,9 +17299,9 @@
       </w:tcPr>
     </w:tblStylePr>
   </w:style>
-  <w:style w:type="table" w:styleId="782">
+  <w:style w:type="table" w:styleId="786">
     <w:name w:val="Grid Table 1 Light - Accent 6"/>
-    <w:basedOn w:val="955"/>
+    <w:basedOn w:val="959"/>
     <w:uiPriority w:val="99"/>
     <w:pPr>
       <w:pBdr/>
@@ -17522,9 +17522,9 @@
       </w:tcPr>
     </w:tblStylePr>
   </w:style>
-  <w:style w:type="table" w:styleId="783">
+  <w:style w:type="table" w:styleId="787">
     <w:name w:val="Grid Table 2"/>
-    <w:basedOn w:val="955"/>
+    <w:basedOn w:val="959"/>
     <w:uiPriority w:val="99"/>
     <w:pPr>
       <w:pBdr/>
@@ -17754,9 +17754,9 @@
       </w:tcPr>
     </w:tblStylePr>
   </w:style>
-  <w:style w:type="table" w:styleId="784">
+  <w:style w:type="table" w:styleId="788">
     <w:name w:val="Grid Table 2 - Accent 1"/>
-    <w:basedOn w:val="955"/>
+    <w:basedOn w:val="959"/>
     <w:uiPriority w:val="99"/>
     <w:pPr>
       <w:pBdr/>
@@ -17986,9 +17986,9 @@
       </w:tcPr>
     </w:tblStylePr>
   </w:style>
-  <w:style w:type="table" w:styleId="785">
+  <w:style w:type="table" w:styleId="789">
     <w:name w:val="Grid Table 2 - Accent 2"/>
-    <w:basedOn w:val="955"/>
+    <w:basedOn w:val="959"/>
     <w:uiPriority w:val="99"/>
     <w:pPr>
       <w:pBdr/>
@@ -18218,9 +18218,9 @@
       </w:tcPr>
     </w:tblStylePr>
   </w:style>
-  <w:style w:type="table" w:styleId="786">
+  <w:style w:type="table" w:styleId="790">
     <w:name w:val="Grid Table 2 - Accent 3"/>
-    <w:basedOn w:val="955"/>
+    <w:basedOn w:val="959"/>
     <w:uiPriority w:val="99"/>
     <w:pPr>
       <w:pBdr/>
@@ -18450,9 +18450,9 @@
       </w:tcPr>
     </w:tblStylePr>
   </w:style>
-  <w:style w:type="table" w:styleId="787">
+  <w:style w:type="table" w:styleId="791">
     <w:name w:val="Grid Table 2 - Accent 4"/>
-    <w:basedOn w:val="955"/>
+    <w:basedOn w:val="959"/>
     <w:uiPriority w:val="99"/>
     <w:pPr>
       <w:pBdr/>
@@ -18682,9 +18682,9 @@
       </w:tcPr>
     </w:tblStylePr>
   </w:style>
-  <w:style w:type="table" w:styleId="788">
+  <w:style w:type="table" w:styleId="792">
     <w:name w:val="Grid Table 2 - Accent 5"/>
-    <w:basedOn w:val="955"/>
+    <w:basedOn w:val="959"/>
     <w:uiPriority w:val="99"/>
     <w:pPr>
       <w:pBdr/>
@@ -18914,9 +18914,9 @@
       </w:tcPr>
     </w:tblStylePr>
   </w:style>
-  <w:style w:type="table" w:styleId="789">
+  <w:style w:type="table" w:styleId="793">
     <w:name w:val="Grid Table 2 - Accent 6"/>
-    <w:basedOn w:val="955"/>
+    <w:basedOn w:val="959"/>
     <w:uiPriority w:val="99"/>
     <w:pPr>
       <w:pBdr/>
@@ -19146,9 +19146,9 @@
       </w:tcPr>
     </w:tblStylePr>
   </w:style>
-  <w:style w:type="table" w:styleId="790">
+  <w:style w:type="table" w:styleId="794">
     <w:name w:val="Grid Table 3"/>
-    <w:basedOn w:val="955"/>
+    <w:basedOn w:val="959"/>
     <w:uiPriority w:val="99"/>
     <w:pPr>
       <w:pBdr/>
@@ -19391,9 +19391,9 @@
       </w:tcPr>
     </w:tblStylePr>
   </w:style>
-  <w:style w:type="table" w:styleId="791">
+  <w:style w:type="table" w:styleId="795">
     <w:name w:val="Grid Table 3 - Accent 1"/>
-    <w:basedOn w:val="955"/>
+    <w:basedOn w:val="959"/>
     <w:uiPriority w:val="99"/>
     <w:pPr>
       <w:pBdr/>
@@ -19636,9 +19636,9 @@
       </w:tcPr>
     </w:tblStylePr>
   </w:style>
-  <w:style w:type="table" w:styleId="792">
+  <w:style w:type="table" w:styleId="796">
     <w:name w:val="Grid Table 3 - Accent 2"/>
-    <w:basedOn w:val="955"/>
+    <w:basedOn w:val="959"/>
     <w:uiPriority w:val="99"/>
     <w:pPr>
       <w:pBdr/>
@@ -19881,9 +19881,9 @@
       </w:tcPr>
     </w:tblStylePr>
   </w:style>
-  <w:style w:type="table" w:styleId="793">
+  <w:style w:type="table" w:styleId="797">
     <w:name w:val="Grid Table 3 - Accent 3"/>
-    <w:basedOn w:val="955"/>
+    <w:basedOn w:val="959"/>
     <w:uiPriority w:val="99"/>
     <w:pPr>
       <w:pBdr/>
@@ -20126,9 +20126,9 @@
       </w:tcPr>
     </w:tblStylePr>
   </w:style>
-  <w:style w:type="table" w:styleId="794">
+  <w:style w:type="table" w:styleId="798">
     <w:name w:val="Grid Table 3 - Accent 4"/>
-    <w:basedOn w:val="955"/>
+    <w:basedOn w:val="959"/>
     <w:uiPriority w:val="99"/>
     <w:pPr>
       <w:pBdr/>
@@ -20371,9 +20371,9 @@
       </w:tcPr>
     </w:tblStylePr>
   </w:style>
-  <w:style w:type="table" w:styleId="795">
+  <w:style w:type="table" w:styleId="799">
     <w:name w:val="Grid Table 3 - Accent 5"/>
-    <w:basedOn w:val="955"/>
+    <w:basedOn w:val="959"/>
     <w:uiPriority w:val="99"/>
     <w:pPr>
       <w:pBdr/>
@@ -20616,9 +20616,9 @@
       </w:tcPr>
     </w:tblStylePr>
   </w:style>
-  <w:style w:type="table" w:styleId="796">
+  <w:style w:type="table" w:styleId="800">
     <w:name w:val="Grid Table 3 - Accent 6"/>
-    <w:basedOn w:val="955"/>
+    <w:basedOn w:val="959"/>
     <w:uiPriority w:val="99"/>
     <w:pPr>
       <w:pBdr/>
@@ -20861,9 +20861,9 @@
       </w:tcPr>
     </w:tblStylePr>
   </w:style>
-  <w:style w:type="table" w:styleId="797">
+  <w:style w:type="table" w:styleId="801">
     <w:name w:val="Grid Table 4"/>
-    <w:basedOn w:val="955"/>
+    <w:basedOn w:val="959"/>
     <w:uiPriority w:val="59"/>
     <w:pPr>
       <w:pBdr/>
@@ -21094,9 +21094,9 @@
       </w:tcPr>
     </w:tblStylePr>
   </w:style>
-  <w:style w:type="table" w:styleId="798">
+  <w:style w:type="table" w:styleId="802">
     <w:name w:val="Grid Table 4 - Accent 1"/>
-    <w:basedOn w:val="955"/>
+    <w:basedOn w:val="959"/>
     <w:uiPriority w:val="59"/>
     <w:pPr>
       <w:pBdr/>
@@ -21327,9 +21327,9 @@
       </w:tcPr>
     </w:tblStylePr>
   </w:style>
-  <w:style w:type="table" w:styleId="799">
+  <w:style w:type="table" w:styleId="803">
     <w:name w:val="Grid Table 4 - Accent 2"/>
-    <w:basedOn w:val="955"/>
+    <w:basedOn w:val="959"/>
     <w:uiPriority w:val="59"/>
     <w:pPr>
       <w:pBdr/>
@@ -21560,9 +21560,9 @@
       </w:tcPr>
     </w:tblStylePr>
   </w:style>
-  <w:style w:type="table" w:styleId="800">
+  <w:style w:type="table" w:styleId="804">
     <w:name w:val="Grid Table 4 - Accent 3"/>
-    <w:basedOn w:val="955"/>
+    <w:basedOn w:val="959"/>
     <w:uiPriority w:val="59"/>
     <w:pPr>
       <w:pBdr/>
@@ -21793,9 +21793,9 @@
       </w:tcPr>
     </w:tblStylePr>
   </w:style>
-  <w:style w:type="table" w:styleId="801">
+  <w:style w:type="table" w:styleId="805">
     <w:name w:val="Grid Table 4 - Accent 4"/>
-    <w:basedOn w:val="955"/>
+    <w:basedOn w:val="959"/>
     <w:uiPriority w:val="59"/>
     <w:pPr>
       <w:pBdr/>
@@ -22026,9 +22026,9 @@
       </w:tcPr>
     </w:tblStylePr>
   </w:style>
-  <w:style w:type="table" w:styleId="802">
+  <w:style w:type="table" w:styleId="806">
     <w:name w:val="Grid Table 4 - Accent 5"/>
-    <w:basedOn w:val="955"/>
+    <w:basedOn w:val="959"/>
     <w:uiPriority w:val="59"/>
     <w:pPr>
       <w:pBdr/>
@@ -22259,9 +22259,9 @@
       </w:tcPr>
     </w:tblStylePr>
   </w:style>
-  <w:style w:type="table" w:styleId="803">
+  <w:style w:type="table" w:styleId="807">
     <w:name w:val="Grid Table 4 - Accent 6"/>
-    <w:basedOn w:val="955"/>
+    <w:basedOn w:val="959"/>
     <w:uiPriority w:val="59"/>
     <w:pPr>
       <w:pBdr/>
@@ -22492,9 +22492,9 @@
       </w:tcPr>
     </w:tblStylePr>
   </w:style>
-  <w:style w:type="table" w:styleId="804">
+  <w:style w:type="table" w:styleId="808">
     <w:name w:val="Grid Table 5 Dark"/>
-    <w:basedOn w:val="955"/>
+    <w:basedOn w:val="959"/>
     <w:uiPriority w:val="99"/>
     <w:pPr>
       <w:pBdr/>
@@ -22720,9 +22720,9 @@
       </w:tcPr>
     </w:tblStylePr>
   </w:style>
-  <w:style w:type="table" w:styleId="805">
+  <w:style w:type="table" w:styleId="809">
     <w:name w:val="Grid Table 5 Dark- Accent 1"/>
-    <w:basedOn w:val="955"/>
+    <w:basedOn w:val="959"/>
     <w:uiPriority w:val="99"/>
     <w:pPr>
       <w:pBdr/>
@@ -22948,9 +22948,9 @@
       </w:tcPr>
     </w:tblStylePr>
   </w:style>
-  <w:style w:type="table" w:styleId="806">
+  <w:style w:type="table" w:styleId="810">
     <w:name w:val="Grid Table 5 Dark - Accent 2"/>
-    <w:basedOn w:val="955"/>
+    <w:basedOn w:val="959"/>
     <w:uiPriority w:val="99"/>
     <w:pPr>
       <w:pBdr/>
@@ -23176,9 +23176,9 @@
       </w:tcPr>
     </w:tblStylePr>
   </w:style>
-  <w:style w:type="table" w:styleId="807">
+  <w:style w:type="table" w:styleId="811">
     <w:name w:val="Grid Table 5 Dark - Accent 3"/>
-    <w:basedOn w:val="955"/>
+    <w:basedOn w:val="959"/>
     <w:uiPriority w:val="99"/>
     <w:pPr>
       <w:pBdr/>
@@ -23404,9 +23404,9 @@
       </w:tcPr>
     </w:tblStylePr>
   </w:style>
-  <w:style w:type="table" w:styleId="808">
+  <w:style w:type="table" w:styleId="812">
     <w:name w:val="Grid Table 5 Dark- Accent 4"/>
-    <w:basedOn w:val="955"/>
+    <w:basedOn w:val="959"/>
     <w:uiPriority w:val="99"/>
     <w:pPr>
       <w:pBdr/>
@@ -23632,9 +23632,9 @@
       </w:tcPr>
     </w:tblStylePr>
   </w:style>
-  <w:style w:type="table" w:styleId="809">
+  <w:style w:type="table" w:styleId="813">
     <w:name w:val="Grid Table 5 Dark - Accent 5"/>
-    <w:basedOn w:val="955"/>
+    <w:basedOn w:val="959"/>
     <w:uiPriority w:val="99"/>
     <w:pPr>
       <w:pBdr/>
@@ -23860,9 +23860,9 @@
       </w:tcPr>
     </w:tblStylePr>
   </w:style>
-  <w:style w:type="table" w:styleId="810">
+  <w:style w:type="table" w:styleId="814">
     <w:name w:val="Grid Table 5 Dark - Accent 6"/>
-    <w:basedOn w:val="955"/>
+    <w:basedOn w:val="959"/>
     <w:uiPriority w:val="99"/>
     <w:pPr>
       <w:pBdr/>
@@ -24088,9 +24088,9 @@
       </w:tcPr>
     </w:tblStylePr>
   </w:style>
-  <w:style w:type="table" w:styleId="811">
+  <w:style w:type="table" w:styleId="815">
     <w:name w:val="Grid Table 6 Colorful"/>
-    <w:basedOn w:val="955"/>
+    <w:basedOn w:val="959"/>
     <w:uiPriority w:val="99"/>
     <w:pPr>
       <w:pBdr/>
@@ -24318,9 +24318,9 @@
       </w:tcPr>
     </w:tblStylePr>
   </w:style>
-  <w:style w:type="table" w:styleId="812">
+  <w:style w:type="table" w:styleId="816">
     <w:name w:val="Grid Table 6 Colorful - Accent 1"/>
-    <w:basedOn w:val="955"/>
+    <w:basedOn w:val="959"/>
     <w:uiPriority w:val="99"/>
     <w:pPr>
       <w:pBdr/>
@@ -24548,9 +24548,9 @@
       </w:tcPr>
     </w:tblStylePr>
   </w:style>
-  <w:style w:type="table" w:styleId="813">
+  <w:style w:type="table" w:styleId="817">
     <w:name w:val="Grid Table 6 Colorful - Accent 2"/>
-    <w:basedOn w:val="955"/>
+    <w:basedOn w:val="959"/>
     <w:uiPriority w:val="99"/>
     <w:pPr>
       <w:pBdr/>
@@ -24778,9 +24778,9 @@
       </w:tcPr>
     </w:tblStylePr>
   </w:style>
-  <w:style w:type="table" w:styleId="814">
+  <w:style w:type="table" w:styleId="818">
     <w:name w:val="Grid Table 6 Colorful - Accent 3"/>
-    <w:basedOn w:val="955"/>
+    <w:basedOn w:val="959"/>
     <w:uiPriority w:val="99"/>
     <w:pPr>
       <w:pBdr/>
@@ -25008,9 +25008,9 @@
       </w:tcPr>
     </w:tblStylePr>
   </w:style>
-  <w:style w:type="table" w:styleId="815">
+  <w:style w:type="table" w:styleId="819">
     <w:name w:val="Grid Table 6 Colorful - Accent 4"/>
-    <w:basedOn w:val="955"/>
+    <w:basedOn w:val="959"/>
     <w:uiPriority w:val="99"/>
     <w:pPr>
       <w:pBdr/>
@@ -25238,9 +25238,9 @@
       </w:tcPr>
     </w:tblStylePr>
   </w:style>
-  <w:style w:type="table" w:styleId="816">
+  <w:style w:type="table" w:styleId="820">
     <w:name w:val="Grid Table 6 Colorful - Accent 5"/>
-    <w:basedOn w:val="955"/>
+    <w:basedOn w:val="959"/>
     <w:uiPriority w:val="99"/>
     <w:pPr>
       <w:pBdr/>
@@ -25468,9 +25468,9 @@
       </w:tcPr>
     </w:tblStylePr>
   </w:style>
-  <w:style w:type="table" w:styleId="817">
+  <w:style w:type="table" w:styleId="821">
     <w:name w:val="Grid Table 6 Colorful - Accent 6"/>
-    <w:basedOn w:val="955"/>
+    <w:basedOn w:val="959"/>
     <w:uiPriority w:val="99"/>
     <w:pPr>
       <w:pBdr/>
@@ -25698,9 +25698,9 @@
       </w:tcPr>
     </w:tblStylePr>
   </w:style>
-  <w:style w:type="table" w:styleId="818">
+  <w:style w:type="table" w:styleId="822">
     <w:name w:val="Grid Table 7 Colorful"/>
-    <w:basedOn w:val="955"/>
+    <w:basedOn w:val="959"/>
     <w:uiPriority w:val="99"/>
     <w:pPr>
       <w:pBdr/>
@@ -25952,9 +25952,9 @@
       </w:tcPr>
     </w:tblStylePr>
   </w:style>
-  <w:style w:type="table" w:styleId="819">
+  <w:style w:type="table" w:styleId="823">
     <w:name w:val="Grid Table 7 Colorful - Accent 1"/>
-    <w:basedOn w:val="955"/>
+    <w:basedOn w:val="959"/>
     <w:uiPriority w:val="99"/>
     <w:pPr>
       <w:pBdr/>
@@ -26206,9 +26206,9 @@
       </w:tcPr>
     </w:tblStylePr>
   </w:style>
-  <w:style w:type="table" w:styleId="820">
+  <w:style w:type="table" w:styleId="824">
     <w:name w:val="Grid Table 7 Colorful - Accent 2"/>
-    <w:basedOn w:val="955"/>
+    <w:basedOn w:val="959"/>
     <w:uiPriority w:val="99"/>
     <w:pPr>
       <w:pBdr/>
@@ -26460,9 +26460,9 @@
       </w:tcPr>
     </w:tblStylePr>
   </w:style>
-  <w:style w:type="table" w:styleId="821">
+  <w:style w:type="table" w:styleId="825">
     <w:name w:val="Grid Table 7 Colorful - Accent 3"/>
-    <w:basedOn w:val="955"/>
+    <w:basedOn w:val="959"/>
     <w:uiPriority w:val="99"/>
     <w:pPr>
       <w:pBdr/>
@@ -26714,9 +26714,9 @@
       </w:tcPr>
     </w:tblStylePr>
   </w:style>
-  <w:style w:type="table" w:styleId="822">
+  <w:style w:type="table" w:styleId="826">
     <w:name w:val="Grid Table 7 Colorful - Accent 4"/>
-    <w:basedOn w:val="955"/>
+    <w:basedOn w:val="959"/>
     <w:uiPriority w:val="99"/>
     <w:pPr>
       <w:pBdr/>
@@ -26968,9 +26968,9 @@
       </w:tcPr>
     </w:tblStylePr>
   </w:style>
-  <w:style w:type="table" w:styleId="823">
+  <w:style w:type="table" w:styleId="827">
     <w:name w:val="Grid Table 7 Colorful - Accent 5"/>
-    <w:basedOn w:val="955"/>
+    <w:basedOn w:val="959"/>
     <w:uiPriority w:val="99"/>
     <w:pPr>
       <w:pBdr/>
@@ -27222,9 +27222,9 @@
       </w:tcPr>
     </w:tblStylePr>
   </w:style>
-  <w:style w:type="table" w:styleId="824">
+  <w:style w:type="table" w:styleId="828">
     <w:name w:val="Grid Table 7 Colorful - Accent 6"/>
-    <w:basedOn w:val="955"/>
+    <w:basedOn w:val="959"/>
     <w:uiPriority w:val="99"/>
     <w:pPr>
       <w:pBdr/>
@@ -27476,9 +27476,9 @@
       </w:tcPr>
     </w:tblStylePr>
   </w:style>
-  <w:style w:type="table" w:styleId="825">
+  <w:style w:type="table" w:styleId="829">
     <w:name w:val="List Table 1 Light"/>
-    <w:basedOn w:val="955"/>
+    <w:basedOn w:val="959"/>
     <w:uiPriority w:val="99"/>
     <w:pPr>
       <w:pBdr/>
@@ -27692,9 +27692,9 @@
       </w:tcPr>
     </w:tblStylePr>
   </w:style>
-  <w:style w:type="table" w:styleId="826">
+  <w:style w:type="table" w:styleId="830">
     <w:name w:val="List Table 1 Light - Accent 1"/>
-    <w:basedOn w:val="955"/>
+    <w:basedOn w:val="959"/>
     <w:uiPriority w:val="99"/>
     <w:pPr>
       <w:pBdr/>
@@ -27908,9 +27908,9 @@
       </w:tcPr>
     </w:tblStylePr>
   </w:style>
-  <w:style w:type="table" w:styleId="827">
+  <w:style w:type="table" w:styleId="831">
     <w:name w:val="List Table 1 Light - Accent 2"/>
-    <w:basedOn w:val="955"/>
+    <w:basedOn w:val="959"/>
     <w:uiPriority w:val="99"/>
     <w:pPr>
       <w:pBdr/>
@@ -28124,9 +28124,9 @@
       </w:tcPr>
     </w:tblStylePr>
   </w:style>
-  <w:style w:type="table" w:styleId="828">
+  <w:style w:type="table" w:styleId="832">
     <w:name w:val="List Table 1 Light - Accent 3"/>
-    <w:basedOn w:val="955"/>
+    <w:basedOn w:val="959"/>
     <w:uiPriority w:val="99"/>
     <w:pPr>
       <w:pBdr/>
@@ -28340,9 +28340,9 @@
       </w:tcPr>
     </w:tblStylePr>
   </w:style>
-  <w:style w:type="table" w:styleId="829">
+  <w:style w:type="table" w:styleId="833">
     <w:name w:val="List Table 1 Light - Accent 4"/>
-    <w:basedOn w:val="955"/>
+    <w:basedOn w:val="959"/>
     <w:uiPriority w:val="99"/>
     <w:pPr>
       <w:pBdr/>
@@ -28556,9 +28556,9 @@
       </w:tcPr>
     </w:tblStylePr>
   </w:style>
-  <w:style w:type="table" w:styleId="830">
+  <w:style w:type="table" w:styleId="834">
     <w:name w:val="List Table 1 Light - Accent 5"/>
-    <w:basedOn w:val="955"/>
+    <w:basedOn w:val="959"/>
     <w:uiPriority w:val="99"/>
     <w:pPr>
       <w:pBdr/>
@@ -28772,9 +28772,9 @@
       </w:tcPr>
     </w:tblStylePr>
   </w:style>
-  <w:style w:type="table" w:styleId="831">
+  <w:style w:type="table" w:styleId="835">
     <w:name w:val="List Table 1 Light - Accent 6"/>
-    <w:basedOn w:val="955"/>
+    <w:basedOn w:val="959"/>
     <w:uiPriority w:val="99"/>
     <w:pPr>
       <w:pBdr/>
@@ -28988,9 +28988,9 @@
       </w:tcPr>
     </w:tblStylePr>
   </w:style>
-  <w:style w:type="table" w:styleId="832">
+  <w:style w:type="table" w:styleId="836">
     <w:name w:val="List Table 2"/>
-    <w:basedOn w:val="955"/>
+    <w:basedOn w:val="959"/>
     <w:uiPriority w:val="99"/>
     <w:pPr>
       <w:pBdr/>
@@ -29226,9 +29226,9 @@
       </w:tcPr>
     </w:tblStylePr>
   </w:style>
-  <w:style w:type="table" w:styleId="833">
+  <w:style w:type="table" w:styleId="837">
     <w:name w:val="List Table 2 - Accent 1"/>
-    <w:basedOn w:val="955"/>
+    <w:basedOn w:val="959"/>
     <w:uiPriority w:val="99"/>
     <w:pPr>
       <w:pBdr/>
@@ -29464,9 +29464,9 @@
       </w:tcPr>
     </w:tblStylePr>
   </w:style>
-  <w:style w:type="table" w:styleId="834">
+  <w:style w:type="table" w:styleId="838">
     <w:name w:val="List Table 2 - Accent 2"/>
-    <w:basedOn w:val="955"/>
+    <w:basedOn w:val="959"/>
     <w:uiPriority w:val="99"/>
     <w:pPr>
       <w:pBdr/>
@@ -29702,9 +29702,9 @@
       </w:tcPr>
     </w:tblStylePr>
   </w:style>
-  <w:style w:type="table" w:styleId="835">
+  <w:style w:type="table" w:styleId="839">
     <w:name w:val="List Table 2 - Accent 3"/>
-    <w:basedOn w:val="955"/>
+    <w:basedOn w:val="959"/>
     <w:uiPriority w:val="99"/>
     <w:pPr>
       <w:pBdr/>
@@ -29940,9 +29940,9 @@
       </w:tcPr>
     </w:tblStylePr>
   </w:style>
-  <w:style w:type="table" w:styleId="836">
+  <w:style w:type="table" w:styleId="840">
     <w:name w:val="List Table 2 - Accent 4"/>
-    <w:basedOn w:val="955"/>
+    <w:basedOn w:val="959"/>
     <w:uiPriority w:val="99"/>
     <w:pPr>
       <w:pBdr/>
@@ -30178,9 +30178,9 @@
       </w:tcPr>
     </w:tblStylePr>
   </w:style>
-  <w:style w:type="table" w:styleId="837">
+  <w:style w:type="table" w:styleId="841">
     <w:name w:val="List Table 2 - Accent 5"/>
-    <w:basedOn w:val="955"/>
+    <w:basedOn w:val="959"/>
     <w:uiPriority w:val="99"/>
     <w:pPr>
       <w:pBdr/>
@@ -30416,9 +30416,9 @@
       </w:tcPr>
     </w:tblStylePr>
   </w:style>
-  <w:style w:type="table" w:styleId="838">
+  <w:style w:type="table" w:styleId="842">
     <w:name w:val="List Table 2 - Accent 6"/>
-    <w:basedOn w:val="955"/>
+    <w:basedOn w:val="959"/>
     <w:uiPriority w:val="99"/>
     <w:pPr>
       <w:pBdr/>
@@ -30654,9 +30654,9 @@
       </w:tcPr>
     </w:tblStylePr>
   </w:style>
-  <w:style w:type="table" w:styleId="839">
+  <w:style w:type="table" w:styleId="843">
     <w:name w:val="List Table 3"/>
-    <w:basedOn w:val="955"/>
+    <w:basedOn w:val="959"/>
     <w:uiPriority w:val="99"/>
     <w:pPr>
       <w:pBdr/>
@@ -30882,9 +30882,9 @@
       </w:tcPr>
     </w:tblStylePr>
   </w:style>
-  <w:style w:type="table" w:styleId="840">
+  <w:style w:type="table" w:styleId="844">
     <w:name w:val="List Table 3 - Accent 1"/>
-    <w:basedOn w:val="955"/>
+    <w:basedOn w:val="959"/>
     <w:uiPriority w:val="99"/>
     <w:pPr>
       <w:pBdr/>
@@ -31110,9 +31110,9 @@
       </w:tcPr>
     </w:tblStylePr>
   </w:style>
-  <w:style w:type="table" w:styleId="841">
+  <w:style w:type="table" w:styleId="845">
     <w:name w:val="List Table 3 - Accent 2"/>
-    <w:basedOn w:val="955"/>
+    <w:basedOn w:val="959"/>
     <w:uiPriority w:val="99"/>
     <w:pPr>
       <w:pBdr/>
@@ -31338,9 +31338,9 @@
       </w:tcPr>
     </w:tblStylePr>
   </w:style>
-  <w:style w:type="table" w:styleId="842">
+  <w:style w:type="table" w:styleId="846">
     <w:name w:val="List Table 3 - Accent 3"/>
-    <w:basedOn w:val="955"/>
+    <w:basedOn w:val="959"/>
     <w:uiPriority w:val="99"/>
     <w:pPr>
       <w:pBdr/>
@@ -31566,9 +31566,9 @@
       </w:tcPr>
     </w:tblStylePr>
   </w:style>
-  <w:style w:type="table" w:styleId="843">
+  <w:style w:type="table" w:styleId="847">
     <w:name w:val="List Table 3 - Accent 4"/>
-    <w:basedOn w:val="955"/>
+    <w:basedOn w:val="959"/>
     <w:uiPriority w:val="99"/>
     <w:pPr>
       <w:pBdr/>
@@ -31794,9 +31794,9 @@
       </w:tcPr>
     </w:tblStylePr>
   </w:style>
-  <w:style w:type="table" w:styleId="844">
+  <w:style w:type="table" w:styleId="848">
     <w:name w:val="List Table 3 - Accent 5"/>
-    <w:basedOn w:val="955"/>
+    <w:basedOn w:val="959"/>
     <w:uiPriority w:val="99"/>
     <w:pPr>
       <w:pBdr/>
@@ -32022,9 +32022,9 @@
       </w:tcPr>
     </w:tblStylePr>
   </w:style>
-  <w:style w:type="table" w:styleId="845">
+  <w:style w:type="table" w:styleId="849">
     <w:name w:val="List Table 3 - Accent 6"/>
-    <w:basedOn w:val="955"/>
+    <w:basedOn w:val="959"/>
     <w:uiPriority w:val="99"/>
     <w:pPr>
       <w:pBdr/>
@@ -32250,9 +32250,9 @@
       </w:tcPr>
     </w:tblStylePr>
   </w:style>
-  <w:style w:type="table" w:styleId="846">
+  <w:style w:type="table" w:styleId="850">
     <w:name w:val="List Table 4"/>
-    <w:basedOn w:val="955"/>
+    <w:basedOn w:val="959"/>
     <w:uiPriority w:val="99"/>
     <w:pPr>
       <w:pBdr/>
@@ -32475,9 +32475,9 @@
       </w:tcPr>
     </w:tblStylePr>
   </w:style>
-  <w:style w:type="table" w:styleId="847">
+  <w:style w:type="table" w:styleId="851">
     <w:name w:val="List Table 4 - Accent 1"/>
-    <w:basedOn w:val="955"/>
+    <w:basedOn w:val="959"/>
     <w:uiPriority w:val="99"/>
     <w:pPr>
       <w:pBdr/>
@@ -32700,9 +32700,9 @@
       </w:tcPr>
     </w:tblStylePr>
   </w:style>
-  <w:style w:type="table" w:styleId="848">
+  <w:style w:type="table" w:styleId="852">
     <w:name w:val="List Table 4 - Accent 2"/>
-    <w:basedOn w:val="955"/>
+    <w:basedOn w:val="959"/>
     <w:uiPriority w:val="99"/>
     <w:pPr>
       <w:pBdr/>
@@ -32925,9 +32925,9 @@
       </w:tcPr>
     </w:tblStylePr>
   </w:style>
-  <w:style w:type="table" w:styleId="849">
+  <w:style w:type="table" w:styleId="853">
     <w:name w:val="List Table 4 - Accent 3"/>
-    <w:basedOn w:val="955"/>
+    <w:basedOn w:val="959"/>
     <w:uiPriority w:val="99"/>
     <w:pPr>
       <w:pBdr/>
@@ -33150,9 +33150,9 @@
       </w:tcPr>
     </w:tblStylePr>
   </w:style>
-  <w:style w:type="table" w:styleId="850">
+  <w:style w:type="table" w:styleId="854">
     <w:name w:val="List Table 4 - Accent 4"/>
-    <w:basedOn w:val="955"/>
+    <w:basedOn w:val="959"/>
     <w:uiPriority w:val="99"/>
     <w:pPr>
       <w:pBdr/>
@@ -33375,9 +33375,9 @@
       </w:tcPr>
     </w:tblStylePr>
   </w:style>
-  <w:style w:type="table" w:styleId="851">
+  <w:style w:type="table" w:styleId="855">
     <w:name w:val="List Table 4 - Accent 5"/>
-    <w:basedOn w:val="955"/>
+    <w:basedOn w:val="959"/>
     <w:uiPriority w:val="99"/>
     <w:pPr>
       <w:pBdr/>
@@ -33600,9 +33600,9 @@
       </w:tcPr>
     </w:tblStylePr>
   </w:style>
-  <w:style w:type="table" w:styleId="852">
+  <w:style w:type="table" w:styleId="856">
     <w:name w:val="List Table 4 - Accent 6"/>
-    <w:basedOn w:val="955"/>
+    <w:basedOn w:val="959"/>
     <w:uiPriority w:val="99"/>
     <w:pPr>
       <w:pBdr/>
@@ -33825,9 +33825,9 @@
       </w:tcPr>
     </w:tblStylePr>
   </w:style>
-  <w:style w:type="table" w:styleId="853">
+  <w:style w:type="table" w:styleId="857">
     <w:name w:val="List Table 5 Dark"/>
-    <w:basedOn w:val="955"/>
+    <w:basedOn w:val="959"/>
     <w:uiPriority w:val="99"/>
     <w:pPr>
       <w:pBdr/>
@@ -34067,9 +34067,9 @@
       </w:tcPr>
     </w:tblStylePr>
   </w:style>
-  <w:style w:type="table" w:styleId="854">
+  <w:style w:type="table" w:styleId="858">
     <w:name w:val="List Table 5 Dark - Accent 1"/>
-    <w:basedOn w:val="955"/>
+    <w:basedOn w:val="959"/>
     <w:uiPriority w:val="99"/>
     <w:pPr>
       <w:pBdr/>
@@ -34309,9 +34309,9 @@
       </w:tcPr>
     </w:tblStylePr>
   </w:style>
-  <w:style w:type="table" w:styleId="855">
+  <w:style w:type="table" w:styleId="859">
     <w:name w:val="List Table 5 Dark - Accent 2"/>
-    <w:basedOn w:val="955"/>
+    <w:basedOn w:val="959"/>
     <w:uiPriority w:val="99"/>
     <w:pPr>
       <w:pBdr/>
@@ -34551,9 +34551,9 @@
       </w:tcPr>
     </w:tblStylePr>
   </w:style>
-  <w:style w:type="table" w:styleId="856">
+  <w:style w:type="table" w:styleId="860">
     <w:name w:val="List Table 5 Dark - Accent 3"/>
-    <w:basedOn w:val="955"/>
+    <w:basedOn w:val="959"/>
     <w:uiPriority w:val="99"/>
     <w:pPr>
       <w:pBdr/>
@@ -34793,9 +34793,9 @@
       </w:tcPr>
     </w:tblStylePr>
   </w:style>
-  <w:style w:type="table" w:styleId="857">
+  <w:style w:type="table" w:styleId="861">
     <w:name w:val="List Table 5 Dark - Accent 4"/>
-    <w:basedOn w:val="955"/>
+    <w:basedOn w:val="959"/>
     <w:uiPriority w:val="99"/>
     <w:pPr>
       <w:pBdr/>
@@ -35035,9 +35035,9 @@
       </w:tcPr>
     </w:tblStylePr>
   </w:style>
-  <w:style w:type="table" w:styleId="858">
+  <w:style w:type="table" w:styleId="862">
     <w:name w:val="List Table 5 Dark - Accent 5"/>
-    <w:basedOn w:val="955"/>
+    <w:basedOn w:val="959"/>
     <w:uiPriority w:val="99"/>
     <w:pPr>
       <w:pBdr/>
@@ -35277,9 +35277,9 @@
       </w:tcPr>
     </w:tblStylePr>
   </w:style>
-  <w:style w:type="table" w:styleId="859">
+  <w:style w:type="table" w:styleId="863">
     <w:name w:val="List Table 5 Dark - Accent 6"/>
-    <w:basedOn w:val="955"/>
+    <w:basedOn w:val="959"/>
     <w:uiPriority w:val="99"/>
     <w:pPr>
       <w:pBdr/>
@@ -35519,9 +35519,9 @@
       </w:tcPr>
     </w:tblStylePr>
   </w:style>
-  <w:style w:type="table" w:styleId="860">
+  <w:style w:type="table" w:styleId="864">
     <w:name w:val="List Table 6 Colorful"/>
-    <w:basedOn w:val="955"/>
+    <w:basedOn w:val="959"/>
     <w:uiPriority w:val="99"/>
     <w:pPr>
       <w:pBdr/>
@@ -35742,9 +35742,9 @@
       </w:tcPr>
     </w:tblStylePr>
   </w:style>
-  <w:style w:type="table" w:styleId="861">
+  <w:style w:type="table" w:styleId="865">
     <w:name w:val="List Table 6 Colorful - Accent 1"/>
-    <w:basedOn w:val="955"/>
+    <w:basedOn w:val="959"/>
     <w:uiPriority w:val="99"/>
     <w:pPr>
       <w:pBdr/>
@@ -35965,9 +35965,9 @@
       </w:tcPr>
     </w:tblStylePr>
   </w:style>
-  <w:style w:type="table" w:styleId="862">
+  <w:style w:type="table" w:styleId="866">
     <w:name w:val="List Table 6 Colorful - Accent 2"/>
-    <w:basedOn w:val="955"/>
+    <w:basedOn w:val="959"/>
     <w:uiPriority w:val="99"/>
     <w:pPr>
       <w:pBdr/>
@@ -36188,9 +36188,9 @@
       </w:tcPr>
     </w:tblStylePr>
   </w:style>
-  <w:style w:type="table" w:styleId="863">
+  <w:style w:type="table" w:styleId="867">
     <w:name w:val="List Table 6 Colorful - Accent 3"/>
-    <w:basedOn w:val="955"/>
+    <w:basedOn w:val="959"/>
     <w:uiPriority w:val="99"/>
     <w:pPr>
       <w:pBdr/>
@@ -36411,9 +36411,9 @@
       </w:tcPr>
     </w:tblStylePr>
   </w:style>
-  <w:style w:type="table" w:styleId="864">
+  <w:style w:type="table" w:styleId="868">
     <w:name w:val="List Table 6 Colorful - Accent 4"/>
-    <w:basedOn w:val="955"/>
+    <w:basedOn w:val="959"/>
     <w:uiPriority w:val="99"/>
     <w:pPr>
       <w:pBdr/>
@@ -36634,9 +36634,9 @@
       </w:tcPr>
     </w:tblStylePr>
   </w:style>
-  <w:style w:type="table" w:styleId="865">
+  <w:style w:type="table" w:styleId="869">
     <w:name w:val="List Table 6 Colorful - Accent 5"/>
-    <w:basedOn w:val="955"/>
+    <w:basedOn w:val="959"/>
     <w:uiPriority w:val="99"/>
     <w:pPr>
       <w:pBdr/>
@@ -36857,9 +36857,9 @@
       </w:tcPr>
     </w:tblStylePr>
   </w:style>
-  <w:style w:type="table" w:styleId="866">
+  <w:style w:type="table" w:styleId="870">
     <w:name w:val="List Table 6 Colorful - Accent 6"/>
-    <w:basedOn w:val="955"/>
+    <w:basedOn w:val="959"/>
     <w:uiPriority w:val="99"/>
     <w:pPr>
       <w:pBdr/>
@@ -37080,9 +37080,9 @@
       </w:tcPr>
     </w:tblStylePr>
   </w:style>
-  <w:style w:type="table" w:styleId="867">
+  <w:style w:type="table" w:styleId="871">
     <w:name w:val="List Table 7 Colorful"/>
-    <w:basedOn w:val="955"/>
+    <w:basedOn w:val="959"/>
     <w:uiPriority w:val="99"/>
     <w:pPr>
       <w:pBdr/>
@@ -37336,9 +37336,9 @@
       </w:tcPr>
     </w:tblStylePr>
   </w:style>
-  <w:style w:type="table" w:styleId="868">
+  <w:style w:type="table" w:styleId="872">
     <w:name w:val="List Table 7 Colorful - Accent 1"/>
-    <w:basedOn w:val="955"/>
+    <w:basedOn w:val="959"/>
     <w:uiPriority w:val="99"/>
     <w:pPr>
       <w:pBdr/>
@@ -37592,9 +37592,9 @@
       </w:tcPr>
     </w:tblStylePr>
   </w:style>
-  <w:style w:type="table" w:styleId="869">
+  <w:style w:type="table" w:styleId="873">
     <w:name w:val="List Table 7 Colorful - Accent 2"/>
-    <w:basedOn w:val="955"/>
+    <w:basedOn w:val="959"/>
     <w:uiPriority w:val="99"/>
     <w:pPr>
       <w:pBdr/>
@@ -37848,9 +37848,9 @@
       </w:tcPr>
     </w:tblStylePr>
   </w:style>
-  <w:style w:type="table" w:styleId="870">
+  <w:style w:type="table" w:styleId="874">
     <w:name w:val="List Table 7 Colorful - Accent 3"/>
-    <w:basedOn w:val="955"/>
+    <w:basedOn w:val="959"/>
     <w:uiPriority w:val="99"/>
     <w:pPr>
       <w:pBdr/>
@@ -38104,9 +38104,9 @@
       </w:tcPr>
     </w:tblStylePr>
   </w:style>
-  <w:style w:type="table" w:styleId="871">
+  <w:style w:type="table" w:styleId="875">
     <w:name w:val="List Table 7 Colorful - Accent 4"/>
-    <w:basedOn w:val="955"/>
+    <w:basedOn w:val="959"/>
     <w:uiPriority w:val="99"/>
     <w:pPr>
       <w:pBdr/>
@@ -38360,9 +38360,9 @@
       </w:tcPr>
     </w:tblStylePr>
   </w:style>
-  <w:style w:type="table" w:styleId="872">
+  <w:style w:type="table" w:styleId="876">
     <w:name w:val="List Table 7 Colorful - Accent 5"/>
-    <w:basedOn w:val="955"/>
+    <w:basedOn w:val="959"/>
     <w:uiPriority w:val="99"/>
     <w:pPr>
       <w:pBdr/>
@@ -38616,9 +38616,9 @@
       </w:tcPr>
     </w:tblStylePr>
   </w:style>
-  <w:style w:type="table" w:styleId="873">
+  <w:style w:type="table" w:styleId="877">
     <w:name w:val="List Table 7 Colorful - Accent 6"/>
-    <w:basedOn w:val="955"/>
+    <w:basedOn w:val="959"/>
     <w:uiPriority w:val="99"/>
     <w:pPr>
       <w:pBdr/>
@@ -38872,9 +38872,9 @@
       </w:tcPr>
     </w:tblStylePr>
   </w:style>
-  <w:style w:type="table" w:styleId="874">
+  <w:style w:type="table" w:styleId="878">
     <w:name w:val="Lined - Accent"/>
-    <w:basedOn w:val="955"/>
+    <w:basedOn w:val="959"/>
     <w:uiPriority w:val="99"/>
     <w:pPr>
       <w:pBdr/>
@@ -39109,9 +39109,9 @@
       </w:tcPr>
     </w:tblStylePr>
   </w:style>
-  <w:style w:type="table" w:styleId="875">
+  <w:style w:type="table" w:styleId="879">
     <w:name w:val="Lined - Accent 1"/>
-    <w:basedOn w:val="955"/>
+    <w:basedOn w:val="959"/>
     <w:uiPriority w:val="99"/>
     <w:pPr>
       <w:pBdr/>
@@ -39346,9 +39346,9 @@
       </w:tcPr>
     </w:tblStylePr>
   </w:style>
-  <w:style w:type="table" w:styleId="876">
+  <w:style w:type="table" w:styleId="880">
     <w:name w:val="Lined - Accent 2"/>
-    <w:basedOn w:val="955"/>
+    <w:basedOn w:val="959"/>
     <w:uiPriority w:val="99"/>
     <w:pPr>
       <w:pBdr/>
@@ -39583,9 +39583,9 @@
       </w:tcPr>
     </w:tblStylePr>
   </w:style>
-  <w:style w:type="table" w:styleId="877">
+  <w:style w:type="table" w:styleId="881">
     <w:name w:val="Lined - Accent 3"/>
-    <w:basedOn w:val="955"/>
+    <w:basedOn w:val="959"/>
     <w:uiPriority w:val="99"/>
     <w:pPr>
       <w:pBdr/>
@@ -39820,9 +39820,9 @@
       </w:tcPr>
     </w:tblStylePr>
   </w:style>
-  <w:style w:type="table" w:styleId="878">
+  <w:style w:type="table" w:styleId="882">
     <w:name w:val="Lined - Accent 4"/>
-    <w:basedOn w:val="955"/>
+    <w:basedOn w:val="959"/>
     <w:uiPriority w:val="99"/>
     <w:pPr>
       <w:pBdr/>
@@ -40057,9 +40057,9 @@
       </w:tcPr>
     </w:tblStylePr>
   </w:style>
-  <w:style w:type="table" w:styleId="879">
+  <w:style w:type="table" w:styleId="883">
     <w:name w:val="Lined - Accent 5"/>
-    <w:basedOn w:val="955"/>
+    <w:basedOn w:val="959"/>
     <w:uiPriority w:val="99"/>
     <w:pPr>
       <w:pBdr/>
@@ -40294,9 +40294,9 @@
       </w:tcPr>
     </w:tblStylePr>
   </w:style>
-  <w:style w:type="table" w:styleId="880">
+  <w:style w:type="table" w:styleId="884">
     <w:name w:val="Lined - Accent 6"/>
-    <w:basedOn w:val="955"/>
+    <w:basedOn w:val="959"/>
     <w:uiPriority w:val="99"/>
     <w:pPr>
       <w:pBdr/>
@@ -40531,9 +40531,9 @@
       </w:tcPr>
     </w:tblStylePr>
   </w:style>
-  <w:style w:type="table" w:styleId="881">
+  <w:style w:type="table" w:styleId="885">
     <w:name w:val="Bordered &amp; Lined - Accent"/>
-    <w:basedOn w:val="955"/>
+    <w:basedOn w:val="959"/>
     <w:uiPriority w:val="99"/>
     <w:pPr>
       <w:pBdr/>
@@ -40775,9 +40775,9 @@
       </w:tcPr>
     </w:tblStylePr>
   </w:style>
-  <w:style w:type="table" w:styleId="882">
+  <w:style w:type="table" w:styleId="886">
     <w:name w:val="Bordered &amp; Lined - Accent 1"/>
-    <w:basedOn w:val="955"/>
+    <w:basedOn w:val="959"/>
     <w:uiPriority w:val="99"/>
     <w:pPr>
       <w:pBdr/>
@@ -41019,9 +41019,9 @@
       </w:tcPr>
     </w:tblStylePr>
   </w:style>
-  <w:style w:type="table" w:styleId="883">
+  <w:style w:type="table" w:styleId="887">
     <w:name w:val="Bordered &amp; Lined - Accent 2"/>
-    <w:basedOn w:val="955"/>
+    <w:basedOn w:val="959"/>
     <w:uiPriority w:val="99"/>
     <w:pPr>
       <w:pBdr/>
@@ -41263,9 +41263,9 @@
       </w:tcPr>
     </w:tblStylePr>
   </w:style>
-  <w:style w:type="table" w:styleId="884">
+  <w:style w:type="table" w:styleId="888">
     <w:name w:val="Bordered &amp; Lined - Accent 3"/>
-    <w:basedOn w:val="955"/>
+    <w:basedOn w:val="959"/>
     <w:uiPriority w:val="99"/>
     <w:pPr>
       <w:pBdr/>
@@ -41507,9 +41507,9 @@
       </w:tcPr>
     </w:tblStylePr>
   </w:style>
-  <w:style w:type="table" w:styleId="885">
+  <w:style w:type="table" w:styleId="889">
     <w:name w:val="Bordered &amp; Lined - Accent 4"/>
-    <w:basedOn w:val="955"/>
+    <w:basedOn w:val="959"/>
     <w:uiPriority w:val="99"/>
     <w:pPr>
       <w:pBdr/>
@@ -41751,9 +41751,9 @@
       </w:tcPr>
     </w:tblStylePr>
   </w:style>
-  <w:style w:type="table" w:styleId="886">
+  <w:style w:type="table" w:styleId="890">
     <w:name w:val="Bordered &amp; Lined - Accent 5"/>
-    <w:basedOn w:val="955"/>
+    <w:basedOn w:val="959"/>
     <w:uiPriority w:val="99"/>
     <w:pPr>
       <w:pBdr/>
@@ -41995,9 +41995,9 @@
       </w:tcPr>
     </w:tblStylePr>
   </w:style>
-  <w:style w:type="table" w:styleId="887">
+  <w:style w:type="table" w:styleId="891">
     <w:name w:val="Bordered &amp; Lined - Accent 6"/>
-    <w:basedOn w:val="955"/>
+    <w:basedOn w:val="959"/>
     <w:uiPriority w:val="99"/>
     <w:pPr>
       <w:pBdr/>
@@ -42239,9 +42239,9 @@
       </w:tcPr>
     </w:tblStylePr>
   </w:style>
-  <w:style w:type="table" w:styleId="888">
+  <w:style w:type="table" w:styleId="892">
     <w:name w:val="Bordered"/>
-    <w:basedOn w:val="955"/>
+    <w:basedOn w:val="959"/>
     <w:uiPriority w:val="99"/>
     <w:pPr>
       <w:pBdr/>
@@ -42470,9 +42470,9 @@
       </w:tcPr>
     </w:tblStylePr>
   </w:style>
-  <w:style w:type="table" w:styleId="889">
+  <w:style w:type="table" w:styleId="893">
     <w:name w:val="Bordered - Accent 1"/>
-    <w:basedOn w:val="955"/>
+    <w:basedOn w:val="959"/>
     <w:uiPriority w:val="99"/>
     <w:pPr>
       <w:pBdr/>
@@ -42701,9 +42701,9 @@
       </w:tcPr>
     </w:tblStylePr>
   </w:style>
-  <w:style w:type="table" w:styleId="890">
+  <w:style w:type="table" w:styleId="894">
     <w:name w:val="Bordered - Accent 2"/>
-    <w:basedOn w:val="955"/>
+    <w:basedOn w:val="959"/>
     <w:uiPriority w:val="99"/>
     <w:pPr>
       <w:pBdr/>
@@ -42932,9 +42932,9 @@
       </w:tcPr>
     </w:tblStylePr>
   </w:style>
-  <w:style w:type="table" w:styleId="891">
+  <w:style w:type="table" w:styleId="895">
     <w:name w:val="Bordered - Accent 3"/>
-    <w:basedOn w:val="955"/>
+    <w:basedOn w:val="959"/>
     <w:uiPriority w:val="99"/>
     <w:pPr>
       <w:pBdr/>
@@ -43163,9 +43163,9 @@
       </w:tcPr>
     </w:tblStylePr>
   </w:style>
-  <w:style w:type="table" w:styleId="892">
+  <w:style w:type="table" w:styleId="896">
     <w:name w:val="Bordered - Accent 4"/>
-    <w:basedOn w:val="955"/>
+    <w:basedOn w:val="959"/>
     <w:uiPriority w:val="99"/>
     <w:pPr>
       <w:pBdr/>
@@ -43394,9 +43394,9 @@
       </w:tcPr>
     </w:tblStylePr>
   </w:style>
-  <w:style w:type="table" w:styleId="893">
+  <w:style w:type="table" w:styleId="897">
     <w:name w:val="Bordered - Accent 5"/>
-    <w:basedOn w:val="955"/>
+    <w:basedOn w:val="959"/>
     <w:uiPriority w:val="99"/>
     <w:pPr>
       <w:pBdr/>
@@ -43625,9 +43625,9 @@
       </w:tcPr>
     </w:tblStylePr>
   </w:style>
-  <w:style w:type="table" w:styleId="894">
+  <w:style w:type="table" w:styleId="898">
     <w:name w:val="Bordered - Accent 6"/>
-    <w:basedOn w:val="955"/>
+    <w:basedOn w:val="959"/>
     <w:uiPriority w:val="99"/>
     <w:pPr>
       <w:pBdr/>
@@ -43856,11 +43856,11 @@
       </w:tcPr>
     </w:tblStylePr>
   </w:style>
-  <w:style w:type="paragraph" w:styleId="895">
+  <w:style w:type="paragraph" w:styleId="899">
     <w:name w:val="Heading 1"/>
-    <w:basedOn w:val="954"/>
-    <w:next w:val="954"/>
-    <w:link w:val="905"/>
+    <w:basedOn w:val="958"/>
+    <w:next w:val="958"/>
+    <w:link w:val="909"/>
     <w:uiPriority w:val="9"/>
     <w:qFormat/>
     <w:pPr>
@@ -43878,11 +43878,11 @@
       <w:szCs w:val="40"/>
     </w:rPr>
   </w:style>
-  <w:style w:type="paragraph" w:styleId="896">
+  <w:style w:type="paragraph" w:styleId="900">
     <w:name w:val="Heading 2"/>
-    <w:basedOn w:val="954"/>
-    <w:next w:val="954"/>
-    <w:link w:val="906"/>
+    <w:basedOn w:val="958"/>
+    <w:next w:val="958"/>
+    <w:link w:val="910"/>
     <w:uiPriority w:val="9"/>
     <w:unhideWhenUsed/>
     <w:qFormat/>
@@ -43901,11 +43901,11 @@
       <w:szCs w:val="32"/>
     </w:rPr>
   </w:style>
-  <w:style w:type="paragraph" w:styleId="897">
+  <w:style w:type="paragraph" w:styleId="901">
     <w:name w:val="Heading 3"/>
-    <w:basedOn w:val="954"/>
-    <w:next w:val="954"/>
-    <w:link w:val="907"/>
+    <w:basedOn w:val="958"/>
+    <w:next w:val="958"/>
+    <w:link w:val="911"/>
     <w:uiPriority w:val="9"/>
     <w:unhideWhenUsed/>
     <w:qFormat/>
@@ -43924,11 +43924,11 @@
       <w:szCs w:val="28"/>
     </w:rPr>
   </w:style>
-  <w:style w:type="paragraph" w:styleId="898">
+  <w:style w:type="paragraph" w:styleId="902">
     <w:name w:val="Heading 4"/>
-    <w:basedOn w:val="954"/>
-    <w:next w:val="954"/>
-    <w:link w:val="908"/>
+    <w:basedOn w:val="958"/>
+    <w:next w:val="958"/>
+    <w:link w:val="912"/>
     <w:uiPriority w:val="9"/>
     <w:unhideWhenUsed/>
     <w:qFormat/>
@@ -43947,11 +43947,11 @@
       <w:color w:val="0f4761" w:themeColor="accent1" w:themeShade="BF"/>
     </w:rPr>
   </w:style>
-  <w:style w:type="paragraph" w:styleId="899">
+  <w:style w:type="paragraph" w:styleId="903">
     <w:name w:val="Heading 5"/>
-    <w:basedOn w:val="954"/>
-    <w:next w:val="954"/>
-    <w:link w:val="909"/>
+    <w:basedOn w:val="958"/>
+    <w:next w:val="958"/>
+    <w:link w:val="913"/>
     <w:uiPriority w:val="9"/>
     <w:unhideWhenUsed/>
     <w:qFormat/>
@@ -43968,11 +43968,11 @@
       <w:color w:val="0f4761" w:themeColor="accent1" w:themeShade="BF"/>
     </w:rPr>
   </w:style>
-  <w:style w:type="paragraph" w:styleId="900">
+  <w:style w:type="paragraph" w:styleId="904">
     <w:name w:val="Heading 6"/>
-    <w:basedOn w:val="954"/>
-    <w:next w:val="954"/>
-    <w:link w:val="910"/>
+    <w:basedOn w:val="958"/>
+    <w:next w:val="958"/>
+    <w:link w:val="914"/>
     <w:uiPriority w:val="9"/>
     <w:unhideWhenUsed/>
     <w:qFormat/>
@@ -43991,11 +43991,11 @@
       <w:color w:val="595959" w:themeColor="text1" w:themeTint="A6"/>
     </w:rPr>
   </w:style>
-  <w:style w:type="paragraph" w:styleId="901">
+  <w:style w:type="paragraph" w:styleId="905">
     <w:name w:val="Heading 7"/>
-    <w:basedOn w:val="954"/>
-    <w:next w:val="954"/>
-    <w:link w:val="911"/>
+    <w:basedOn w:val="958"/>
+    <w:next w:val="958"/>
+    <w:link w:val="915"/>
     <w:uiPriority w:val="9"/>
     <w:unhideWhenUsed/>
     <w:qFormat/>
@@ -44012,11 +44012,11 @@
       <w:color w:val="595959" w:themeColor="text1" w:themeTint="A6"/>
     </w:rPr>
   </w:style>
-  <w:style w:type="paragraph" w:styleId="902">
+  <w:style w:type="paragraph" w:styleId="906">
     <w:name w:val="Heading 8"/>
-    <w:basedOn w:val="954"/>
-    <w:next w:val="954"/>
-    <w:link w:val="912"/>
+    <w:basedOn w:val="958"/>
+    <w:next w:val="958"/>
+    <w:link w:val="916"/>
     <w:uiPriority w:val="9"/>
     <w:unhideWhenUsed/>
     <w:qFormat/>
@@ -44035,11 +44035,11 @@
       <w:color w:val="272727" w:themeColor="text1" w:themeTint="D8"/>
     </w:rPr>
   </w:style>
-  <w:style w:type="paragraph" w:styleId="903">
+  <w:style w:type="paragraph" w:styleId="907">
     <w:name w:val="Heading 9"/>
-    <w:basedOn w:val="954"/>
-    <w:next w:val="954"/>
-    <w:link w:val="913"/>
+    <w:basedOn w:val="958"/>
+    <w:next w:val="958"/>
+    <w:link w:val="917"/>
     <w:uiPriority w:val="9"/>
     <w:unhideWhenUsed/>
     <w:qFormat/>
@@ -44058,7 +44058,7 @@
       <w:color w:val="272727" w:themeColor="text1" w:themeTint="D8"/>
     </w:rPr>
   </w:style>
-  <w:style w:type="character" w:styleId="904" w:default="1">
+  <w:style w:type="character" w:styleId="908" w:default="1">
     <w:name w:val="Default Paragraph Font"/>
     <w:uiPriority w:val="1"/>
     <w:semiHidden/>
@@ -44069,10 +44069,10 @@
       <w:ind/>
     </w:pPr>
   </w:style>
-  <w:style w:type="character" w:styleId="905">
+  <w:style w:type="character" w:styleId="909">
     <w:name w:val="Heading 1 Char"/>
-    <w:basedOn w:val="904"/>
-    <w:link w:val="895"/>
+    <w:basedOn w:val="908"/>
+    <w:link w:val="899"/>
     <w:uiPriority w:val="9"/>
     <w:pPr>
       <w:pBdr/>
@@ -44086,10 +44086,10 @@
       <w:szCs w:val="40"/>
     </w:rPr>
   </w:style>
-  <w:style w:type="character" w:styleId="906">
+  <w:style w:type="character" w:styleId="910">
     <w:name w:val="Heading 2 Char"/>
-    <w:basedOn w:val="904"/>
-    <w:link w:val="896"/>
+    <w:basedOn w:val="908"/>
+    <w:link w:val="900"/>
     <w:uiPriority w:val="9"/>
     <w:pPr>
       <w:pBdr/>
@@ -44103,10 +44103,10 @@
       <w:szCs w:val="32"/>
     </w:rPr>
   </w:style>
-  <w:style w:type="character" w:styleId="907">
+  <w:style w:type="character" w:styleId="911">
     <w:name w:val="Heading 3 Char"/>
-    <w:basedOn w:val="904"/>
-    <w:link w:val="897"/>
+    <w:basedOn w:val="908"/>
+    <w:link w:val="901"/>
     <w:uiPriority w:val="9"/>
     <w:pPr>
       <w:pBdr/>
@@ -44120,10 +44120,10 @@
       <w:szCs w:val="28"/>
     </w:rPr>
   </w:style>
-  <w:style w:type="character" w:styleId="908">
+  <w:style w:type="character" w:styleId="912">
     <w:name w:val="Heading 4 Char"/>
-    <w:basedOn w:val="904"/>
-    <w:link w:val="898"/>
+    <w:basedOn w:val="908"/>
+    <w:link w:val="902"/>
     <w:uiPriority w:val="9"/>
     <w:pPr>
       <w:pBdr/>
@@ -44137,10 +44137,10 @@
       <w:color w:val="0f4761" w:themeColor="accent1" w:themeShade="BF"/>
     </w:rPr>
   </w:style>
-  <w:style w:type="character" w:styleId="909">
+  <w:style w:type="character" w:styleId="913">
     <w:name w:val="Heading 5 Char"/>
-    <w:basedOn w:val="904"/>
-    <w:link w:val="899"/>
+    <w:basedOn w:val="908"/>
+    <w:link w:val="903"/>
     <w:uiPriority w:val="9"/>
     <w:pPr>
       <w:pBdr/>
@@ -44152,10 +44152,10 @@
       <w:color w:val="0f4761" w:themeColor="accent1" w:themeShade="BF"/>
     </w:rPr>
   </w:style>
-  <w:style w:type="character" w:styleId="910">
+  <w:style w:type="character" w:styleId="914">
     <w:name w:val="Heading 6 Char"/>
-    <w:basedOn w:val="904"/>
-    <w:link w:val="900"/>
+    <w:basedOn w:val="908"/>
+    <w:link w:val="904"/>
     <w:uiPriority w:val="9"/>
     <w:pPr>
       <w:pBdr/>
@@ -44169,10 +44169,10 @@
       <w:color w:val="595959" w:themeColor="text1" w:themeTint="A6"/>
     </w:rPr>
   </w:style>
-  <w:style w:type="character" w:styleId="911">
+  <w:style w:type="character" w:styleId="915">
     <w:name w:val="Heading 7 Char"/>
-    <w:basedOn w:val="904"/>
-    <w:link w:val="901"/>
+    <w:basedOn w:val="908"/>
+    <w:link w:val="905"/>
     <w:uiPriority w:val="9"/>
     <w:pPr>
       <w:pBdr/>
@@ -44184,10 +44184,10 @@
       <w:color w:val="595959" w:themeColor="text1" w:themeTint="A6"/>
     </w:rPr>
   </w:style>
-  <w:style w:type="character" w:styleId="912">
+  <w:style w:type="character" w:styleId="916">
     <w:name w:val="Heading 8 Char"/>
-    <w:basedOn w:val="904"/>
-    <w:link w:val="902"/>
+    <w:basedOn w:val="908"/>
+    <w:link w:val="906"/>
     <w:uiPriority w:val="9"/>
     <w:pPr>
       <w:pBdr/>
@@ -44201,10 +44201,10 @@
       <w:color w:val="272727" w:themeColor="text1" w:themeTint="D8"/>
     </w:rPr>
   </w:style>
-  <w:style w:type="character" w:styleId="913">
+  <w:style w:type="character" w:styleId="917">
     <w:name w:val="Heading 9 Char"/>
-    <w:basedOn w:val="904"/>
-    <w:link w:val="903"/>
+    <w:basedOn w:val="908"/>
+    <w:link w:val="907"/>
     <w:uiPriority w:val="9"/>
     <w:pPr>
       <w:pBdr/>
@@ -44218,11 +44218,11 @@
       <w:color w:val="272727" w:themeColor="text1" w:themeTint="D8"/>
     </w:rPr>
   </w:style>
-  <w:style w:type="paragraph" w:styleId="914">
+  <w:style w:type="paragraph" w:styleId="918">
     <w:name w:val="Title"/>
-    <w:basedOn w:val="954"/>
-    <w:next w:val="954"/>
-    <w:link w:val="915"/>
+    <w:basedOn w:val="958"/>
+    <w:next w:val="958"/>
+    <w:link w:val="919"/>
     <w:uiPriority w:val="10"/>
     <w:qFormat/>
     <w:pPr>
@@ -44238,10 +44238,10 @@
       <w:szCs w:val="56"/>
     </w:rPr>
   </w:style>
-  <w:style w:type="character" w:styleId="915">
+  <w:style w:type="character" w:styleId="919">
     <w:name w:val="Title Char"/>
-    <w:basedOn w:val="904"/>
-    <w:link w:val="914"/>
+    <w:basedOn w:val="908"/>
+    <w:link w:val="918"/>
     <w:uiPriority w:val="10"/>
     <w:pPr>
       <w:pBdr/>
@@ -44255,11 +44255,11 @@
       <w:szCs w:val="56"/>
     </w:rPr>
   </w:style>
-  <w:style w:type="paragraph" w:styleId="916">
+  <w:style w:type="paragraph" w:styleId="920">
     <w:name w:val="Subtitle"/>
-    <w:basedOn w:val="954"/>
-    <w:next w:val="954"/>
-    <w:link w:val="917"/>
+    <w:basedOn w:val="958"/>
+    <w:next w:val="958"/>
+    <w:link w:val="921"/>
     <w:uiPriority w:val="11"/>
     <w:qFormat/>
     <w:pPr>
@@ -44277,10 +44277,10 @@
       <w:szCs w:val="28"/>
     </w:rPr>
   </w:style>
-  <w:style w:type="character" w:styleId="917">
+  <w:style w:type="character" w:styleId="921">
     <w:name w:val="Subtitle Char"/>
-    <w:basedOn w:val="904"/>
-    <w:link w:val="916"/>
+    <w:basedOn w:val="908"/>
+    <w:link w:val="920"/>
     <w:uiPriority w:val="11"/>
     <w:pPr>
       <w:pBdr/>
@@ -44294,11 +44294,11 @@
       <w:szCs w:val="28"/>
     </w:rPr>
   </w:style>
-  <w:style w:type="paragraph" w:styleId="918">
+  <w:style w:type="paragraph" w:styleId="922">
     <w:name w:val="Quote"/>
-    <w:basedOn w:val="954"/>
-    <w:next w:val="954"/>
-    <w:link w:val="919"/>
+    <w:basedOn w:val="958"/>
+    <w:next w:val="958"/>
+    <w:link w:val="923"/>
     <w:uiPriority w:val="29"/>
     <w:qFormat/>
     <w:pPr>
@@ -44313,10 +44313,10 @@
       <w:color w:val="404040" w:themeColor="text1" w:themeTint="BF"/>
     </w:rPr>
   </w:style>
-  <w:style w:type="character" w:styleId="919">
+  <w:style w:type="character" w:styleId="923">
     <w:name w:val="Quote Char"/>
-    <w:basedOn w:val="904"/>
-    <w:link w:val="918"/>
+    <w:basedOn w:val="908"/>
+    <w:link w:val="922"/>
     <w:uiPriority w:val="29"/>
     <w:pPr>
       <w:pBdr/>
@@ -44329,9 +44329,9 @@
       <w:color w:val="404040" w:themeColor="text1" w:themeTint="BF"/>
     </w:rPr>
   </w:style>
-  <w:style w:type="character" w:styleId="920">
+  <w:style w:type="character" w:styleId="924">
     <w:name w:val="Intense Emphasis"/>
-    <w:basedOn w:val="904"/>
+    <w:basedOn w:val="908"/>
     <w:uiPriority w:val="21"/>
     <w:qFormat/>
     <w:pPr>
@@ -44345,11 +44345,11 @@
       <w:color w:val="0f4761" w:themeColor="accent1" w:themeShade="BF"/>
     </w:rPr>
   </w:style>
-  <w:style w:type="paragraph" w:styleId="921">
+  <w:style w:type="paragraph" w:styleId="925">
     <w:name w:val="Intense Quote"/>
-    <w:basedOn w:val="954"/>
-    <w:next w:val="954"/>
-    <w:link w:val="922"/>
+    <w:basedOn w:val="958"/>
+    <w:next w:val="958"/>
+    <w:link w:val="926"/>
     <w:uiPriority w:val="30"/>
     <w:qFormat/>
     <w:pPr>
@@ -44367,10 +44367,10 @@
       <w:color w:val="0f4761" w:themeColor="accent1" w:themeShade="BF"/>
     </w:rPr>
   </w:style>
-  <w:style w:type="character" w:styleId="922">
+  <w:style w:type="character" w:styleId="926">
     <w:name w:val="Intense Quote Char"/>
-    <w:basedOn w:val="904"/>
-    <w:link w:val="921"/>
+    <w:basedOn w:val="908"/>
+    <w:link w:val="925"/>
     <w:uiPriority w:val="30"/>
     <w:pPr>
       <w:pBdr/>
@@ -44383,9 +44383,9 @@
       <w:color w:val="0f4761" w:themeColor="accent1" w:themeShade="BF"/>
     </w:rPr>
   </w:style>
-  <w:style w:type="character" w:styleId="923">
+  <w:style w:type="character" w:styleId="927">
     <w:name w:val="Intense Reference"/>
-    <w:basedOn w:val="904"/>
+    <w:basedOn w:val="908"/>
     <w:uiPriority w:val="32"/>
     <w:qFormat/>
     <w:pPr>
@@ -44401,9 +44401,9 @@
       <w:spacing w:val="5"/>
     </w:rPr>
   </w:style>
-  <w:style w:type="character" w:styleId="924">
+  <w:style w:type="character" w:styleId="928">
     <w:name w:val="Subtle Emphasis"/>
-    <w:basedOn w:val="904"/>
+    <w:basedOn w:val="908"/>
     <w:uiPriority w:val="19"/>
     <w:qFormat/>
     <w:pPr>
@@ -44417,9 +44417,9 @@
       <w:color w:val="404040" w:themeColor="text1" w:themeTint="BF"/>
     </w:rPr>
   </w:style>
-  <w:style w:type="character" w:styleId="925">
+  <w:style w:type="character" w:styleId="929">
     <w:name w:val="Emphasis"/>
-    <w:basedOn w:val="904"/>
+    <w:basedOn w:val="908"/>
     <w:uiPriority w:val="20"/>
     <w:qFormat/>
     <w:pPr>
@@ -44432,9 +44432,9 @@
       <w:iCs/>
     </w:rPr>
   </w:style>
-  <w:style w:type="character" w:styleId="926">
+  <w:style w:type="character" w:styleId="930">
     <w:name w:val="Strong"/>
-    <w:basedOn w:val="904"/>
+    <w:basedOn w:val="908"/>
     <w:uiPriority w:val="22"/>
     <w:qFormat/>
     <w:pPr>
@@ -44447,9 +44447,9 @@
       <w:bCs/>
     </w:rPr>
   </w:style>
-  <w:style w:type="character" w:styleId="927">
+  <w:style w:type="character" w:styleId="931">
     <w:name w:val="Subtle Reference"/>
-    <w:basedOn w:val="904"/>
+    <w:basedOn w:val="908"/>
     <w:uiPriority w:val="31"/>
     <w:qFormat/>
     <w:pPr>
@@ -44462,9 +44462,9 @@
       <w:color w:val="5a5a5a" w:themeColor="text1" w:themeTint="A5"/>
     </w:rPr>
   </w:style>
-  <w:style w:type="character" w:styleId="928">
+  <w:style w:type="character" w:styleId="932">
     <w:name w:val="Book Title"/>
-    <w:basedOn w:val="904"/>
+    <w:basedOn w:val="908"/>
     <w:uiPriority w:val="33"/>
     <w:qFormat/>
     <w:pPr>
@@ -44480,10 +44480,10 @@
       <w:spacing w:val="5"/>
     </w:rPr>
   </w:style>
-  <w:style w:type="paragraph" w:styleId="929">
+  <w:style w:type="paragraph" w:styleId="933">
     <w:name w:val="Header"/>
-    <w:basedOn w:val="954"/>
-    <w:link w:val="930"/>
+    <w:basedOn w:val="958"/>
+    <w:link w:val="934"/>
     <w:uiPriority w:val="99"/>
     <w:unhideWhenUsed/>
     <w:pPr>
@@ -44496,10 +44496,10 @@
       <w:ind/>
     </w:pPr>
   </w:style>
-  <w:style w:type="character" w:styleId="930">
+  <w:style w:type="character" w:styleId="934">
     <w:name w:val="Header Char"/>
-    <w:basedOn w:val="904"/>
-    <w:link w:val="929"/>
+    <w:basedOn w:val="908"/>
+    <w:link w:val="933"/>
     <w:uiPriority w:val="99"/>
     <w:pPr>
       <w:pBdr/>
@@ -44507,10 +44507,10 @@
       <w:ind/>
     </w:pPr>
   </w:style>
-  <w:style w:type="paragraph" w:styleId="931">
+  <w:style w:type="paragraph" w:styleId="935">
     <w:name w:val="Footer"/>
-    <w:basedOn w:val="954"/>
-    <w:link w:val="932"/>
+    <w:basedOn w:val="958"/>
+    <w:link w:val="936"/>
     <w:uiPriority w:val="99"/>
     <w:unhideWhenUsed/>
     <w:pPr>
@@ -44523,10 +44523,10 @@
       <w:ind/>
     </w:pPr>
   </w:style>
-  <w:style w:type="character" w:styleId="932">
+  <w:style w:type="character" w:styleId="936">
     <w:name w:val="Footer Char"/>
-    <w:basedOn w:val="904"/>
-    <w:link w:val="931"/>
+    <w:basedOn w:val="908"/>
+    <w:link w:val="935"/>
     <w:uiPriority w:val="99"/>
     <w:pPr>
       <w:pBdr/>
@@ -44534,10 +44534,10 @@
       <w:ind/>
     </w:pPr>
   </w:style>
-  <w:style w:type="paragraph" w:styleId="933">
+  <w:style w:type="paragraph" w:styleId="937">
     <w:name w:val="Caption"/>
-    <w:basedOn w:val="954"/>
-    <w:next w:val="954"/>
+    <w:basedOn w:val="958"/>
+    <w:next w:val="958"/>
     <w:uiPriority w:val="35"/>
     <w:unhideWhenUsed/>
     <w:qFormat/>
@@ -44554,10 +44554,10 @@
       <w:szCs w:val="18"/>
     </w:rPr>
   </w:style>
-  <w:style w:type="paragraph" w:styleId="934">
+  <w:style w:type="paragraph" w:styleId="938">
     <w:name w:val="footnote text"/>
-    <w:basedOn w:val="954"/>
-    <w:link w:val="935"/>
+    <w:basedOn w:val="958"/>
+    <w:link w:val="939"/>
     <w:uiPriority w:val="99"/>
     <w:semiHidden/>
     <w:unhideWhenUsed/>
@@ -44571,10 +44571,10 @@
       <w:szCs w:val="20"/>
     </w:rPr>
   </w:style>
-  <w:style w:type="character" w:styleId="935">
+  <w:style w:type="character" w:styleId="939">
     <w:name w:val="Footnote Text Char"/>
-    <w:basedOn w:val="904"/>
-    <w:link w:val="934"/>
+    <w:basedOn w:val="908"/>
+    <w:link w:val="938"/>
     <w:uiPriority w:val="99"/>
     <w:semiHidden/>
     <w:pPr>
@@ -44587,9 +44587,9 @@
       <w:szCs w:val="20"/>
     </w:rPr>
   </w:style>
-  <w:style w:type="character" w:styleId="936">
+  <w:style w:type="character" w:styleId="940">
     <w:name w:val="footnote reference"/>
-    <w:basedOn w:val="904"/>
+    <w:basedOn w:val="908"/>
     <w:uiPriority w:val="99"/>
     <w:semiHidden/>
     <w:unhideWhenUsed/>
@@ -44602,10 +44602,10 @@
       <w:vertAlign w:val="superscript"/>
     </w:rPr>
   </w:style>
-  <w:style w:type="paragraph" w:styleId="937">
+  <w:style w:type="paragraph" w:styleId="941">
     <w:name w:val="endnote text"/>
-    <w:basedOn w:val="954"/>
-    <w:link w:val="938"/>
+    <w:basedOn w:val="958"/>
+    <w:link w:val="942"/>
     <w:uiPriority w:val="99"/>
     <w:semiHidden/>
     <w:unhideWhenUsed/>
@@ -44619,10 +44619,10 @@
       <w:szCs w:val="20"/>
     </w:rPr>
   </w:style>
-  <w:style w:type="character" w:styleId="938">
+  <w:style w:type="character" w:styleId="942">
     <w:name w:val="Endnote Text Char"/>
-    <w:basedOn w:val="904"/>
-    <w:link w:val="937"/>
+    <w:basedOn w:val="908"/>
+    <w:link w:val="941"/>
     <w:uiPriority w:val="99"/>
     <w:semiHidden/>
     <w:pPr>
@@ -44635,9 +44635,9 @@
       <w:szCs w:val="20"/>
     </w:rPr>
   </w:style>
-  <w:style w:type="character" w:styleId="939">
+  <w:style w:type="character" w:styleId="943">
     <w:name w:val="endnote reference"/>
-    <w:basedOn w:val="904"/>
+    <w:basedOn w:val="908"/>
     <w:uiPriority w:val="99"/>
     <w:semiHidden/>
     <w:unhideWhenUsed/>
@@ -44650,9 +44650,9 @@
       <w:vertAlign w:val="superscript"/>
     </w:rPr>
   </w:style>
-  <w:style w:type="character" w:styleId="940">
+  <w:style w:type="character" w:styleId="944">
     <w:name w:val="Hyperlink"/>
-    <w:basedOn w:val="904"/>
+    <w:basedOn w:val="908"/>
     <w:uiPriority w:val="99"/>
     <w:unhideWhenUsed/>
     <w:pPr>
@@ -44665,9 +44665,9 @@
       <w:u w:val="single"/>
     </w:rPr>
   </w:style>
-  <w:style w:type="character" w:styleId="941">
+  <w:style w:type="character" w:styleId="945">
     <w:name w:val="FollowedHyperlink"/>
-    <w:basedOn w:val="904"/>
+    <w:basedOn w:val="908"/>
     <w:uiPriority w:val="99"/>
     <w:semiHidden/>
     <w:unhideWhenUsed/>
@@ -44681,10 +44681,10 @@
       <w:u w:val="single"/>
     </w:rPr>
   </w:style>
-  <w:style w:type="paragraph" w:styleId="942">
+  <w:style w:type="paragraph" w:styleId="946">
     <w:name w:val="toc 1"/>
-    <w:basedOn w:val="954"/>
-    <w:next w:val="954"/>
+    <w:basedOn w:val="958"/>
+    <w:next w:val="958"/>
     <w:uiPriority w:val="39"/>
     <w:unhideWhenUsed/>
     <w:pPr>
@@ -44693,10 +44693,10 @@
       <w:ind/>
     </w:pPr>
   </w:style>
-  <w:style w:type="paragraph" w:styleId="943">
+  <w:style w:type="paragraph" w:styleId="947">
     <w:name w:val="toc 2"/>
-    <w:basedOn w:val="954"/>
-    <w:next w:val="954"/>
+    <w:basedOn w:val="958"/>
+    <w:next w:val="958"/>
     <w:uiPriority w:val="39"/>
     <w:unhideWhenUsed/>
     <w:pPr>
@@ -44705,10 +44705,10 @@
       <w:ind w:left="220"/>
     </w:pPr>
   </w:style>
-  <w:style w:type="paragraph" w:styleId="944">
+  <w:style w:type="paragraph" w:styleId="948">
     <w:name w:val="toc 3"/>
-    <w:basedOn w:val="954"/>
-    <w:next w:val="954"/>
+    <w:basedOn w:val="958"/>
+    <w:next w:val="958"/>
     <w:uiPriority w:val="39"/>
     <w:unhideWhenUsed/>
     <w:pPr>
@@ -44717,10 +44717,10 @@
       <w:ind w:left="440"/>
     </w:pPr>
   </w:style>
-  <w:style w:type="paragraph" w:styleId="945">
+  <w:style w:type="paragraph" w:styleId="949">
     <w:name w:val="toc 4"/>
-    <w:basedOn w:val="954"/>
-    <w:next w:val="954"/>
+    <w:basedOn w:val="958"/>
+    <w:next w:val="958"/>
     <w:uiPriority w:val="39"/>
     <w:unhideWhenUsed/>
     <w:pPr>
@@ -44729,10 +44729,10 @@
       <w:ind w:left="660"/>
     </w:pPr>
   </w:style>
-  <w:style w:type="paragraph" w:styleId="946">
+  <w:style w:type="paragraph" w:styleId="950">
     <w:name w:val="toc 5"/>
-    <w:basedOn w:val="954"/>
-    <w:next w:val="954"/>
+    <w:basedOn w:val="958"/>
+    <w:next w:val="958"/>
     <w:uiPriority w:val="39"/>
     <w:unhideWhenUsed/>
     <w:pPr>
@@ -44741,10 +44741,10 @@
       <w:ind w:left="880"/>
     </w:pPr>
   </w:style>
-  <w:style w:type="paragraph" w:styleId="947">
+  <w:style w:type="paragraph" w:styleId="951">
     <w:name w:val="toc 6"/>
-    <w:basedOn w:val="954"/>
-    <w:next w:val="954"/>
+    <w:basedOn w:val="958"/>
+    <w:next w:val="958"/>
     <w:uiPriority w:val="39"/>
     <w:unhideWhenUsed/>
     <w:pPr>
@@ -44753,10 +44753,10 @@
       <w:ind w:left="1100"/>
     </w:pPr>
   </w:style>
-  <w:style w:type="paragraph" w:styleId="948">
+  <w:style w:type="paragraph" w:styleId="952">
     <w:name w:val="toc 7"/>
-    <w:basedOn w:val="954"/>
-    <w:next w:val="954"/>
+    <w:basedOn w:val="958"/>
+    <w:next w:val="958"/>
     <w:uiPriority w:val="39"/>
     <w:unhideWhenUsed/>
     <w:pPr>
@@ -44765,10 +44765,10 @@
       <w:ind w:left="1320"/>
     </w:pPr>
   </w:style>
-  <w:style w:type="paragraph" w:styleId="949">
+  <w:style w:type="paragraph" w:styleId="953">
     <w:name w:val="toc 8"/>
-    <w:basedOn w:val="954"/>
-    <w:next w:val="954"/>
+    <w:basedOn w:val="958"/>
+    <w:next w:val="958"/>
     <w:uiPriority w:val="39"/>
     <w:unhideWhenUsed/>
     <w:pPr>
@@ -44777,10 +44777,10 @@
       <w:ind w:left="1540"/>
     </w:pPr>
   </w:style>
-  <w:style w:type="paragraph" w:styleId="950">
+  <w:style w:type="paragraph" w:styleId="954">
     <w:name w:val="toc 9"/>
-    <w:basedOn w:val="954"/>
-    <w:next w:val="954"/>
+    <w:basedOn w:val="958"/>
+    <w:next w:val="958"/>
     <w:uiPriority w:val="39"/>
     <w:unhideWhenUsed/>
     <w:pPr>
@@ -44789,9 +44789,9 @@
       <w:ind w:left="1760"/>
     </w:pPr>
   </w:style>
-  <w:style w:type="character" w:styleId="951">
+  <w:style w:type="character" w:styleId="955">
     <w:name w:val="Placeholder Text"/>
-    <w:basedOn w:val="904"/>
+    <w:basedOn w:val="908"/>
     <w:uiPriority w:val="99"/>
     <w:semiHidden/>
     <w:pPr>
@@ -44803,7 +44803,7 @@
       <w:color w:val="666666"/>
     </w:rPr>
   </w:style>
-  <w:style w:type="paragraph" w:styleId="952">
+  <w:style w:type="paragraph" w:styleId="956">
     <w:name w:val="TOC Heading"/>
     <w:uiPriority w:val="39"/>
     <w:unhideWhenUsed/>
@@ -44813,10 +44813,10 @@
       <w:ind/>
     </w:pPr>
   </w:style>
-  <w:style w:type="paragraph" w:styleId="953">
+  <w:style w:type="paragraph" w:styleId="957">
     <w:name w:val="table of figures"/>
-    <w:basedOn w:val="954"/>
-    <w:next w:val="954"/>
+    <w:basedOn w:val="958"/>
+    <w:next w:val="958"/>
     <w:uiPriority w:val="99"/>
     <w:unhideWhenUsed/>
     <w:pPr>
@@ -44825,7 +44825,7 @@
       <w:ind/>
     </w:pPr>
   </w:style>
-  <w:style w:type="paragraph" w:styleId="954" w:default="1">
+  <w:style w:type="paragraph" w:styleId="958" w:default="1">
     <w:name w:val="Normal"/>
     <w:qFormat/>
     <w:pPr>
@@ -44834,7 +44834,7 @@
       <w:ind/>
     </w:pPr>
   </w:style>
-  <w:style w:type="table" w:styleId="955" w:default="1">
+  <w:style w:type="table" w:styleId="959" w:default="1">
     <w:name w:val="Normal Table"/>
     <w:uiPriority w:val="99"/>
     <w:semiHidden/>
@@ -44846,13 +44846,13 @@
     </w:pPr>
     <w:tblPr>
       <w:tblInd w:w="0" w:type="dxa"/>
-      <w:tblBorders/>
       <w:tblCellMar>
         <w:left w:w="108" w:type="dxa"/>
         <w:top w:w="0" w:type="dxa"/>
         <w:right w:w="108" w:type="dxa"/>
         <w:bottom w:w="0" w:type="dxa"/>
       </w:tblCellMar>
+      <w:tblBorders/>
     </w:tblPr>
     <w:tcPr>
       <w:tcBorders/>
@@ -45027,7 +45027,7 @@
       </w:tcPr>
     </w:tblStylePr>
   </w:style>
-  <w:style w:type="numbering" w:styleId="956" w:default="1">
+  <w:style w:type="numbering" w:styleId="960" w:default="1">
     <w:name w:val="No List"/>
     <w:uiPriority w:val="99"/>
     <w:semiHidden/>
@@ -45038,9 +45038,9 @@
       <w:ind/>
     </w:pPr>
   </w:style>
-  <w:style w:type="paragraph" w:styleId="957">
+  <w:style w:type="paragraph" w:styleId="961">
     <w:name w:val="No Spacing"/>
-    <w:basedOn w:val="954"/>
+    <w:basedOn w:val="958"/>
     <w:uiPriority w:val="1"/>
     <w:qFormat/>
     <w:pPr>
@@ -45049,9 +45049,9 @@
       <w:ind/>
     </w:pPr>
   </w:style>
-  <w:style w:type="paragraph" w:styleId="958">
+  <w:style w:type="paragraph" w:styleId="962">
     <w:name w:val="List Paragraph"/>
-    <w:basedOn w:val="954"/>
+    <w:basedOn w:val="958"/>
     <w:uiPriority w:val="34"/>
     <w:qFormat/>
     <w:pPr>

</xml_diff>